<commit_message>
Deploy 2026-04-17 14:02 — 66 file(s) updated
</commit_message>
<xml_diff>
--- a/Megamalai.docx
+++ b/Megamalai.docx
@@ -4,6 +4,1574 @@
   <w:body>
     <w:p>
       <w:pPr>
+        <w:pStyle w:val="BodyText"/>
+        <w:bidi w:val="0"/>
+        <w:spacing w:lineRule="auto" w:line="240" w:before="0" w:after="0"/>
+        <w:jc w:val="start"/>
+        <w:rPr>
+          <w:rFonts w:ascii="Times New Roman" w:hAnsi="Times New Roman"/>
+          <w:b w:val="false"/>
+          <w:bCs w:val="false"/>
+          <w:sz w:val="24"/>
+          <w:szCs w:val="24"/>
+        </w:rPr>
+      </w:pPr>
+      <w:r>
+        <w:rPr>
+          <w:rFonts w:ascii="Times New Roman" w:hAnsi="Times New Roman"/>
+          <w:b w:val="false"/>
+          <w:bCs w:val="false"/>
+          <w:sz w:val="24"/>
+          <w:szCs w:val="24"/>
+        </w:rPr>
+        <w:t xml:space="preserve">And your complete </w:t>
+      </w:r>
+      <w:r>
+        <w:rPr>
+          <w:rStyle w:val="SourceText"/>
+          <w:rFonts w:ascii="Times New Roman" w:hAnsi="Times New Roman"/>
+          <w:b w:val="false"/>
+          <w:bCs w:val="false"/>
+          <w:sz w:val="24"/>
+          <w:szCs w:val="24"/>
+        </w:rPr>
+        <w:t>blog_posts.json</w:t>
+      </w:r>
+      <w:r>
+        <w:rPr>
+          <w:rFonts w:ascii="Times New Roman" w:hAnsi="Times New Roman"/>
+          <w:b w:val="false"/>
+          <w:bCs w:val="false"/>
+          <w:sz w:val="24"/>
+          <w:szCs w:val="24"/>
+        </w:rPr>
+        <w:t xml:space="preserve"> entry for this post:</w:t>
+      </w:r>
+    </w:p>
+    <w:p>
+      <w:pPr>
+        <w:pStyle w:val="BodyText"/>
+        <w:spacing w:lineRule="auto" w:line="240"/>
+        <w:ind w:hanging="0" w:start="0" w:end="0"/>
+        <w:rPr>
+          <w:rFonts w:ascii="Times New Roman" w:hAnsi="Times New Roman"/>
+        </w:rPr>
+      </w:pPr>
+      <w:r>
+        <w:rPr>
+          <w:rFonts w:ascii="Times New Roman" w:hAnsi="Times New Roman"/>
+        </w:rPr>
+        <w:t>json</w:t>
+      </w:r>
+    </w:p>
+    <w:p>
+      <w:pPr>
+        <w:pStyle w:val="PreformattedText"/>
+        <w:ind w:hanging="0" w:start="0" w:end="0"/>
+        <w:rPr>
+          <w:rFonts w:ascii="Times New Roman" w:hAnsi="Times New Roman" w:eastAsia="Songti SC" w:cs="Arial Unicode MS"/>
+          <w:sz w:val="24"/>
+          <w:szCs w:val="24"/>
+        </w:rPr>
+      </w:pPr>
+      <w:r>
+        <w:rPr>
+          <w:rStyle w:val="SourceText"/>
+          <w:rFonts w:ascii="var font-mono" w:hAnsi="var font-mono"/>
+          <w:color w:val="2B303B"/>
+          <w:sz w:val="24"/>
+          <w:szCs w:val="24"/>
+          <w:shd w:fill="auto" w:val="clear"/>
+        </w:rPr>
+        <w:t>{</w:t>
+      </w:r>
+    </w:p>
+    <w:p>
+      <w:pPr>
+        <w:pStyle w:val="PreformattedText"/>
+        <w:ind w:hanging="0" w:start="0" w:end="0"/>
+        <w:rPr>
+          <w:rFonts w:ascii="Times New Roman" w:hAnsi="Times New Roman" w:eastAsia="Songti SC" w:cs="Arial Unicode MS"/>
+          <w:sz w:val="24"/>
+          <w:szCs w:val="24"/>
+        </w:rPr>
+      </w:pPr>
+      <w:r>
+        <w:rPr>
+          <w:rStyle w:val="SourceText"/>
+          <w:rFonts w:ascii="Times New Roman" w:hAnsi="Times New Roman"/>
+          <w:color w:val="14181F"/>
+          <w:sz w:val="24"/>
+          <w:szCs w:val="24"/>
+          <w:shd w:fill="auto" w:val="clear"/>
+        </w:rPr>
+        <w:t xml:space="preserve">  </w:t>
+      </w:r>
+      <w:r>
+        <w:rPr>
+          <w:rStyle w:val="SourceText"/>
+          <w:rFonts w:ascii="var font-mono" w:hAnsi="var font-mono"/>
+          <w:color w:val="B80A18"/>
+          <w:sz w:val="24"/>
+          <w:szCs w:val="24"/>
+          <w:shd w:fill="auto" w:val="clear"/>
+        </w:rPr>
+        <w:t>"id"</w:t>
+      </w:r>
+      <w:r>
+        <w:rPr>
+          <w:rStyle w:val="SourceText"/>
+          <w:rFonts w:ascii="var font-mono" w:hAnsi="var font-mono"/>
+          <w:color w:val="14181F"/>
+          <w:sz w:val="24"/>
+          <w:szCs w:val="24"/>
+          <w:shd w:fill="auto" w:val="clear"/>
+        </w:rPr>
+        <w:t xml:space="preserve">: </w:t>
+      </w:r>
+      <w:r>
+        <w:rPr>
+          <w:rStyle w:val="SourceText"/>
+          <w:rFonts w:ascii="var font-mono" w:hAnsi="var font-mono"/>
+          <w:color w:val="008000"/>
+          <w:sz w:val="24"/>
+          <w:szCs w:val="24"/>
+          <w:shd w:fill="auto" w:val="clear"/>
+        </w:rPr>
+        <w:t>"Megamalai-2026"</w:t>
+      </w:r>
+      <w:r>
+        <w:rPr>
+          <w:rStyle w:val="SourceText"/>
+          <w:rFonts w:ascii="var font-mono" w:hAnsi="var font-mono"/>
+          <w:color w:val="2B303B"/>
+          <w:sz w:val="24"/>
+          <w:szCs w:val="24"/>
+          <w:shd w:fill="auto" w:val="clear"/>
+        </w:rPr>
+        <w:t>,</w:t>
+      </w:r>
+    </w:p>
+    <w:p>
+      <w:pPr>
+        <w:pStyle w:val="PreformattedText"/>
+        <w:ind w:hanging="0" w:start="0" w:end="0"/>
+        <w:rPr>
+          <w:rFonts w:ascii="Times New Roman" w:hAnsi="Times New Roman" w:eastAsia="Songti SC" w:cs="Arial Unicode MS"/>
+          <w:sz w:val="24"/>
+          <w:szCs w:val="24"/>
+        </w:rPr>
+      </w:pPr>
+      <w:r>
+        <w:rPr>
+          <w:rStyle w:val="SourceText"/>
+          <w:rFonts w:ascii="Times New Roman" w:hAnsi="Times New Roman"/>
+          <w:color w:val="14181F"/>
+          <w:sz w:val="24"/>
+          <w:szCs w:val="24"/>
+          <w:shd w:fill="auto" w:val="clear"/>
+        </w:rPr>
+        <w:t xml:space="preserve">  </w:t>
+      </w:r>
+      <w:r>
+        <w:rPr>
+          <w:rStyle w:val="SourceText"/>
+          <w:rFonts w:ascii="var font-mono" w:hAnsi="var font-mono"/>
+          <w:color w:val="B80A18"/>
+          <w:sz w:val="24"/>
+          <w:szCs w:val="24"/>
+          <w:shd w:fill="auto" w:val="clear"/>
+        </w:rPr>
+        <w:t>"title"</w:t>
+      </w:r>
+      <w:r>
+        <w:rPr>
+          <w:rStyle w:val="SourceText"/>
+          <w:rFonts w:ascii="var font-mono" w:hAnsi="var font-mono"/>
+          <w:color w:val="14181F"/>
+          <w:sz w:val="24"/>
+          <w:szCs w:val="24"/>
+          <w:shd w:fill="auto" w:val="clear"/>
+        </w:rPr>
+        <w:t xml:space="preserve">: </w:t>
+      </w:r>
+      <w:r>
+        <w:rPr>
+          <w:rStyle w:val="SourceText"/>
+          <w:rFonts w:ascii="var font-mono" w:hAnsi="var font-mono"/>
+          <w:color w:val="008000"/>
+          <w:sz w:val="24"/>
+          <w:szCs w:val="24"/>
+          <w:shd w:fill="auto" w:val="clear"/>
+        </w:rPr>
+        <w:t>"Megamalai – The Plan That Wasn't!"</w:t>
+      </w:r>
+      <w:r>
+        <w:rPr>
+          <w:rStyle w:val="SourceText"/>
+          <w:rFonts w:ascii="var font-mono" w:hAnsi="var font-mono"/>
+          <w:color w:val="2B303B"/>
+          <w:sz w:val="24"/>
+          <w:szCs w:val="24"/>
+          <w:shd w:fill="auto" w:val="clear"/>
+        </w:rPr>
+        <w:t>,</w:t>
+      </w:r>
+    </w:p>
+    <w:p>
+      <w:pPr>
+        <w:pStyle w:val="PreformattedText"/>
+        <w:ind w:hanging="0" w:start="0" w:end="0"/>
+        <w:rPr>
+          <w:rFonts w:ascii="Times New Roman" w:hAnsi="Times New Roman" w:eastAsia="Songti SC" w:cs="Arial Unicode MS"/>
+          <w:sz w:val="24"/>
+          <w:szCs w:val="24"/>
+        </w:rPr>
+      </w:pPr>
+      <w:r>
+        <w:rPr>
+          <w:rStyle w:val="SourceText"/>
+          <w:rFonts w:ascii="Times New Roman" w:hAnsi="Times New Roman"/>
+          <w:color w:val="14181F"/>
+          <w:sz w:val="24"/>
+          <w:szCs w:val="24"/>
+          <w:shd w:fill="auto" w:val="clear"/>
+        </w:rPr>
+        <w:t xml:space="preserve">  </w:t>
+      </w:r>
+      <w:r>
+        <w:rPr>
+          <w:rStyle w:val="SourceText"/>
+          <w:rFonts w:ascii="var font-mono" w:hAnsi="var font-mono"/>
+          <w:color w:val="B80A18"/>
+          <w:sz w:val="24"/>
+          <w:szCs w:val="24"/>
+          <w:shd w:fill="auto" w:val="clear"/>
+        </w:rPr>
+        <w:t>"dates_visited"</w:t>
+      </w:r>
+      <w:r>
+        <w:rPr>
+          <w:rStyle w:val="SourceText"/>
+          <w:rFonts w:ascii="var font-mono" w:hAnsi="var font-mono"/>
+          <w:color w:val="14181F"/>
+          <w:sz w:val="24"/>
+          <w:szCs w:val="24"/>
+          <w:shd w:fill="auto" w:val="clear"/>
+        </w:rPr>
+        <w:t xml:space="preserve">: </w:t>
+      </w:r>
+      <w:r>
+        <w:rPr>
+          <w:rStyle w:val="SourceText"/>
+          <w:rFonts w:ascii="var font-mono" w:hAnsi="var font-mono"/>
+          <w:color w:val="008000"/>
+          <w:sz w:val="24"/>
+          <w:szCs w:val="24"/>
+          <w:shd w:fill="auto" w:val="clear"/>
+        </w:rPr>
+        <w:t>"January 2026"</w:t>
+      </w:r>
+      <w:r>
+        <w:rPr>
+          <w:rStyle w:val="SourceText"/>
+          <w:rFonts w:ascii="var font-mono" w:hAnsi="var font-mono"/>
+          <w:color w:val="2B303B"/>
+          <w:sz w:val="24"/>
+          <w:szCs w:val="24"/>
+          <w:shd w:fill="auto" w:val="clear"/>
+        </w:rPr>
+        <w:t>,</w:t>
+      </w:r>
+    </w:p>
+    <w:p>
+      <w:pPr>
+        <w:pStyle w:val="PreformattedText"/>
+        <w:ind w:hanging="0" w:start="0" w:end="0"/>
+        <w:rPr>
+          <w:rFonts w:ascii="Times New Roman" w:hAnsi="Times New Roman" w:eastAsia="Songti SC" w:cs="Arial Unicode MS"/>
+          <w:sz w:val="24"/>
+          <w:szCs w:val="24"/>
+        </w:rPr>
+      </w:pPr>
+      <w:r>
+        <w:rPr>
+          <w:rStyle w:val="SourceText"/>
+          <w:rFonts w:ascii="Times New Roman" w:hAnsi="Times New Roman"/>
+          <w:color w:val="14181F"/>
+          <w:sz w:val="24"/>
+          <w:szCs w:val="24"/>
+          <w:shd w:fill="auto" w:val="clear"/>
+        </w:rPr>
+        <w:t xml:space="preserve">  </w:t>
+      </w:r>
+      <w:r>
+        <w:rPr>
+          <w:rStyle w:val="SourceText"/>
+          <w:rFonts w:ascii="var font-mono" w:hAnsi="var font-mono"/>
+          <w:color w:val="B80A18"/>
+          <w:sz w:val="24"/>
+          <w:szCs w:val="24"/>
+          <w:shd w:fill="auto" w:val="clear"/>
+        </w:rPr>
+        <w:t>"place"</w:t>
+      </w:r>
+      <w:r>
+        <w:rPr>
+          <w:rStyle w:val="SourceText"/>
+          <w:rFonts w:ascii="var font-mono" w:hAnsi="var font-mono"/>
+          <w:color w:val="14181F"/>
+          <w:sz w:val="24"/>
+          <w:szCs w:val="24"/>
+          <w:shd w:fill="auto" w:val="clear"/>
+        </w:rPr>
+        <w:t xml:space="preserve">: </w:t>
+      </w:r>
+      <w:r>
+        <w:rPr>
+          <w:rStyle w:val="SourceText"/>
+          <w:rFonts w:ascii="var font-mono" w:hAnsi="var font-mono"/>
+          <w:color w:val="008000"/>
+          <w:sz w:val="24"/>
+          <w:szCs w:val="24"/>
+          <w:shd w:fill="auto" w:val="clear"/>
+        </w:rPr>
+        <w:t>"Megamalai"</w:t>
+      </w:r>
+      <w:r>
+        <w:rPr>
+          <w:rStyle w:val="SourceText"/>
+          <w:rFonts w:ascii="var font-mono" w:hAnsi="var font-mono"/>
+          <w:color w:val="2B303B"/>
+          <w:sz w:val="24"/>
+          <w:szCs w:val="24"/>
+          <w:shd w:fill="auto" w:val="clear"/>
+        </w:rPr>
+        <w:t>,</w:t>
+      </w:r>
+    </w:p>
+    <w:p>
+      <w:pPr>
+        <w:pStyle w:val="PreformattedText"/>
+        <w:ind w:hanging="0" w:start="0" w:end="0"/>
+        <w:rPr>
+          <w:rFonts w:ascii="Times New Roman" w:hAnsi="Times New Roman" w:eastAsia="Songti SC" w:cs="Arial Unicode MS"/>
+          <w:sz w:val="24"/>
+          <w:szCs w:val="24"/>
+        </w:rPr>
+      </w:pPr>
+      <w:r>
+        <w:rPr>
+          <w:rStyle w:val="SourceText"/>
+          <w:rFonts w:ascii="Times New Roman" w:hAnsi="Times New Roman"/>
+          <w:color w:val="14181F"/>
+          <w:sz w:val="24"/>
+          <w:szCs w:val="24"/>
+          <w:shd w:fill="auto" w:val="clear"/>
+        </w:rPr>
+        <w:t xml:space="preserve">  </w:t>
+      </w:r>
+      <w:r>
+        <w:rPr>
+          <w:rStyle w:val="SourceText"/>
+          <w:rFonts w:ascii="var font-mono" w:hAnsi="var font-mono"/>
+          <w:color w:val="B80A18"/>
+          <w:sz w:val="24"/>
+          <w:szCs w:val="24"/>
+          <w:shd w:fill="auto" w:val="clear"/>
+        </w:rPr>
+        <w:t>"place_tag"</w:t>
+      </w:r>
+      <w:r>
+        <w:rPr>
+          <w:rStyle w:val="SourceText"/>
+          <w:rFonts w:ascii="var font-mono" w:hAnsi="var font-mono"/>
+          <w:color w:val="14181F"/>
+          <w:sz w:val="24"/>
+          <w:szCs w:val="24"/>
+          <w:shd w:fill="auto" w:val="clear"/>
+        </w:rPr>
+        <w:t xml:space="preserve">: </w:t>
+      </w:r>
+      <w:r>
+        <w:rPr>
+          <w:rStyle w:val="SourceText"/>
+          <w:rFonts w:ascii="var font-mono" w:hAnsi="var font-mono"/>
+          <w:color w:val="008000"/>
+          <w:sz w:val="24"/>
+          <w:szCs w:val="24"/>
+          <w:shd w:fill="auto" w:val="clear"/>
+        </w:rPr>
+        <w:t>"Megamalai"</w:t>
+      </w:r>
+      <w:r>
+        <w:rPr>
+          <w:rStyle w:val="SourceText"/>
+          <w:rFonts w:ascii="var font-mono" w:hAnsi="var font-mono"/>
+          <w:color w:val="2B303B"/>
+          <w:sz w:val="24"/>
+          <w:szCs w:val="24"/>
+          <w:shd w:fill="auto" w:val="clear"/>
+        </w:rPr>
+        <w:t>,</w:t>
+      </w:r>
+    </w:p>
+    <w:p>
+      <w:pPr>
+        <w:pStyle w:val="PreformattedText"/>
+        <w:ind w:hanging="0" w:start="0" w:end="0"/>
+        <w:rPr>
+          <w:rFonts w:ascii="Times New Roman" w:hAnsi="Times New Roman" w:eastAsia="Songti SC" w:cs="Arial Unicode MS"/>
+          <w:sz w:val="24"/>
+          <w:szCs w:val="24"/>
+        </w:rPr>
+      </w:pPr>
+      <w:r>
+        <w:rPr>
+          <w:rStyle w:val="SourceText"/>
+          <w:rFonts w:ascii="Times New Roman" w:hAnsi="Times New Roman"/>
+          <w:color w:val="14181F"/>
+          <w:sz w:val="24"/>
+          <w:szCs w:val="24"/>
+          <w:shd w:fill="auto" w:val="clear"/>
+        </w:rPr>
+        <w:t xml:space="preserve">  </w:t>
+      </w:r>
+      <w:r>
+        <w:rPr>
+          <w:rStyle w:val="SourceText"/>
+          <w:rFonts w:ascii="var font-mono" w:hAnsi="var font-mono"/>
+          <w:color w:val="B80A18"/>
+          <w:sz w:val="24"/>
+          <w:szCs w:val="24"/>
+          <w:shd w:fill="auto" w:val="clear"/>
+        </w:rPr>
+        <w:t>"country"</w:t>
+      </w:r>
+      <w:r>
+        <w:rPr>
+          <w:rStyle w:val="SourceText"/>
+          <w:rFonts w:ascii="var font-mono" w:hAnsi="var font-mono"/>
+          <w:color w:val="14181F"/>
+          <w:sz w:val="24"/>
+          <w:szCs w:val="24"/>
+          <w:shd w:fill="auto" w:val="clear"/>
+        </w:rPr>
+        <w:t xml:space="preserve">: </w:t>
+      </w:r>
+      <w:r>
+        <w:rPr>
+          <w:rStyle w:val="SourceText"/>
+          <w:rFonts w:ascii="var font-mono" w:hAnsi="var font-mono"/>
+          <w:color w:val="008000"/>
+          <w:sz w:val="24"/>
+          <w:szCs w:val="24"/>
+          <w:shd w:fill="auto" w:val="clear"/>
+        </w:rPr>
+        <w:t>"Tamil Nadu, India"</w:t>
+      </w:r>
+      <w:r>
+        <w:rPr>
+          <w:rStyle w:val="SourceText"/>
+          <w:rFonts w:ascii="var font-mono" w:hAnsi="var font-mono"/>
+          <w:color w:val="2B303B"/>
+          <w:sz w:val="24"/>
+          <w:szCs w:val="24"/>
+          <w:shd w:fill="auto" w:val="clear"/>
+        </w:rPr>
+        <w:t>,</w:t>
+      </w:r>
+    </w:p>
+    <w:p>
+      <w:pPr>
+        <w:pStyle w:val="PreformattedText"/>
+        <w:ind w:hanging="0" w:start="0" w:end="0"/>
+        <w:rPr>
+          <w:rFonts w:ascii="Times New Roman" w:hAnsi="Times New Roman" w:eastAsia="Songti SC" w:cs="Arial Unicode MS"/>
+          <w:sz w:val="24"/>
+          <w:szCs w:val="24"/>
+        </w:rPr>
+      </w:pPr>
+      <w:r>
+        <w:rPr>
+          <w:rStyle w:val="SourceText"/>
+          <w:rFonts w:ascii="Times New Roman" w:hAnsi="Times New Roman"/>
+          <w:color w:val="14181F"/>
+          <w:sz w:val="24"/>
+          <w:szCs w:val="24"/>
+          <w:shd w:fill="auto" w:val="clear"/>
+        </w:rPr>
+        <w:t xml:space="preserve">  </w:t>
+      </w:r>
+      <w:r>
+        <w:rPr>
+          <w:rStyle w:val="SourceText"/>
+          <w:rFonts w:ascii="var font-mono" w:hAnsi="var font-mono"/>
+          <w:color w:val="B80A18"/>
+          <w:sz w:val="24"/>
+          <w:szCs w:val="24"/>
+          <w:shd w:fill="auto" w:val="clear"/>
+        </w:rPr>
+        <w:t>"summary"</w:t>
+      </w:r>
+      <w:r>
+        <w:rPr>
+          <w:rStyle w:val="SourceText"/>
+          <w:rFonts w:ascii="var font-mono" w:hAnsi="var font-mono"/>
+          <w:color w:val="14181F"/>
+          <w:sz w:val="24"/>
+          <w:szCs w:val="24"/>
+          <w:shd w:fill="auto" w:val="clear"/>
+        </w:rPr>
+        <w:t xml:space="preserve">: </w:t>
+      </w:r>
+      <w:r>
+        <w:rPr>
+          <w:rStyle w:val="SourceText"/>
+          <w:rFonts w:ascii="var font-mono" w:hAnsi="var font-mono"/>
+          <w:color w:val="008000"/>
+          <w:sz w:val="24"/>
+          <w:szCs w:val="24"/>
+          <w:shd w:fill="auto" w:val="clear"/>
+        </w:rPr>
+        <w:t xml:space="preserve">"An unplanned detour to Megamalai, </w:t>
+      </w:r>
+      <w:r>
+        <w:rPr>
+          <w:rStyle w:val="SourceText"/>
+          <w:rFonts w:ascii="var font-mono" w:hAnsi="var font-mono"/>
+          <w:color w:val="008000"/>
+          <w:sz w:val="24"/>
+          <w:szCs w:val="24"/>
+          <w:shd w:fill="auto" w:val="clear"/>
+        </w:rPr>
+        <w:t>w</w:t>
+      </w:r>
+      <w:r>
+        <w:rPr>
+          <w:rStyle w:val="SourceText"/>
+          <w:rFonts w:ascii="var font-mono" w:hAnsi="var font-mono"/>
+          <w:color w:val="008000"/>
+          <w:sz w:val="24"/>
+          <w:szCs w:val="24"/>
+          <w:shd w:fill="auto" w:val="clear"/>
+        </w:rPr>
+        <w:t>h</w:t>
+      </w:r>
+      <w:r>
+        <w:rPr>
+          <w:rStyle w:val="SourceText"/>
+          <w:rFonts w:ascii="var font-mono" w:hAnsi="var font-mono"/>
+          <w:color w:val="008000"/>
+          <w:sz w:val="24"/>
+          <w:szCs w:val="24"/>
+          <w:shd w:fill="auto" w:val="clear"/>
+        </w:rPr>
+        <w:t>ile on the way to Munnar</w:t>
+      </w:r>
+      <w:r>
+        <w:rPr>
+          <w:rStyle w:val="SourceText"/>
+          <w:rFonts w:ascii="var font-mono" w:hAnsi="var font-mono"/>
+          <w:color w:val="008000"/>
+          <w:sz w:val="24"/>
+          <w:szCs w:val="24"/>
+          <w:shd w:fill="auto" w:val="clear"/>
+        </w:rPr>
+        <w:t xml:space="preserve"> – Tamil Nadu's Hill of Clouds – and one of the best mornings we never planned for."</w:t>
+      </w:r>
+      <w:r>
+        <w:rPr>
+          <w:rStyle w:val="SourceText"/>
+          <w:rFonts w:ascii="var font-mono" w:hAnsi="var font-mono"/>
+          <w:color w:val="2B303B"/>
+          <w:sz w:val="24"/>
+          <w:szCs w:val="24"/>
+          <w:shd w:fill="auto" w:val="clear"/>
+        </w:rPr>
+        <w:t>,</w:t>
+      </w:r>
+    </w:p>
+    <w:p>
+      <w:pPr>
+        <w:pStyle w:val="PreformattedText"/>
+        <w:ind w:hanging="0" w:start="0" w:end="0"/>
+        <w:rPr>
+          <w:rFonts w:ascii="Times New Roman" w:hAnsi="Times New Roman" w:eastAsia="Songti SC" w:cs="Arial Unicode MS"/>
+          <w:sz w:val="24"/>
+          <w:szCs w:val="24"/>
+        </w:rPr>
+      </w:pPr>
+      <w:r>
+        <w:rPr>
+          <w:rStyle w:val="SourceText"/>
+          <w:rFonts w:ascii="Times New Roman" w:hAnsi="Times New Roman"/>
+          <w:color w:val="14181F"/>
+          <w:sz w:val="24"/>
+          <w:szCs w:val="24"/>
+          <w:shd w:fill="auto" w:val="clear"/>
+        </w:rPr>
+        <w:t xml:space="preserve">  </w:t>
+      </w:r>
+      <w:r>
+        <w:rPr>
+          <w:rStyle w:val="SourceText"/>
+          <w:rFonts w:ascii="var font-mono" w:hAnsi="var font-mono"/>
+          <w:color w:val="B80A18"/>
+          <w:sz w:val="24"/>
+          <w:szCs w:val="24"/>
+          <w:shd w:fill="auto" w:val="clear"/>
+        </w:rPr>
+        <w:t>"body"</w:t>
+      </w:r>
+      <w:r>
+        <w:rPr>
+          <w:rStyle w:val="SourceText"/>
+          <w:rFonts w:ascii="var font-mono" w:hAnsi="var font-mono"/>
+          <w:color w:val="14181F"/>
+          <w:sz w:val="24"/>
+          <w:szCs w:val="24"/>
+          <w:shd w:fill="auto" w:val="clear"/>
+        </w:rPr>
+        <w:t xml:space="preserve">: </w:t>
+      </w:r>
+      <w:r>
+        <w:rPr>
+          <w:rStyle w:val="SourceText"/>
+          <w:rFonts w:ascii="var font-mono" w:hAnsi="var font-mono"/>
+          <w:color w:val="008000"/>
+          <w:sz w:val="24"/>
+          <w:szCs w:val="24"/>
+          <w:shd w:fill="auto" w:val="clear"/>
+        </w:rPr>
+        <w:t>"paste the body text above here"</w:t>
+      </w:r>
+    </w:p>
+    <w:p>
+      <w:pPr>
+        <w:pStyle w:val="PreformattedText"/>
+        <w:spacing w:before="0" w:after="283"/>
+        <w:ind w:hanging="0" w:start="0" w:end="0"/>
+        <w:rPr>
+          <w:rFonts w:ascii="Times New Roman" w:hAnsi="Times New Roman" w:eastAsia="Songti SC" w:cs="Arial Unicode MS"/>
+          <w:sz w:val="24"/>
+          <w:szCs w:val="24"/>
+        </w:rPr>
+      </w:pPr>
+      <w:r>
+        <w:rPr>
+          <w:rStyle w:val="SourceText"/>
+          <w:rFonts w:ascii="var font-mono" w:hAnsi="var font-mono"/>
+          <w:color w:val="2B303B"/>
+          <w:sz w:val="24"/>
+          <w:szCs w:val="24"/>
+          <w:shd w:fill="auto" w:val="clear"/>
+        </w:rPr>
+        <w:t>}</w:t>
+      </w:r>
+    </w:p>
+    <w:p>
+      <w:pPr>
+        <w:pStyle w:val="BodyText"/>
+        <w:tabs>
+          <w:tab w:val="clear" w:pos="709"/>
+          <w:tab w:val="left" w:pos="0" w:leader="none"/>
+        </w:tabs>
+        <w:spacing w:lineRule="auto" w:line="240" w:before="0" w:after="0"/>
+        <w:ind w:hanging="283" w:start="709"/>
+        <w:rPr>
+          <w:rFonts w:ascii="Times New Roman" w:hAnsi="Times New Roman"/>
+        </w:rPr>
+      </w:pPr>
+      <w:r>
+        <w:rPr>
+          <w:rStyle w:val="SourceText"/>
+          <w:rFonts w:ascii="Times New Roman" w:hAnsi="Times New Roman"/>
+        </w:rPr>
+        <w:t>[</w:t>
+      </w:r>
+      <w:r>
+        <w:rPr>
+          <w:rStyle w:val="SourceText"/>
+          <w:rFonts w:ascii="Times New Roman" w:hAnsi="Times New Roman"/>
+        </w:rPr>
+        <w:t xml:space="preserve">photo: </w:t>
+      </w:r>
+      <w:r>
+        <w:rPr>
+          <w:rStyle w:val="SourceText"/>
+          <w:rFonts w:ascii="Times New Roman" w:hAnsi="Times New Roman"/>
+        </w:rPr>
+        <w:t>2026-0305-Megamalai-NCM-7747-49</w:t>
+      </w:r>
+      <w:r>
+        <w:rPr>
+          <w:rStyle w:val="SourceText"/>
+          <w:rFonts w:ascii="Times New Roman" w:hAnsi="Times New Roman"/>
+        </w:rPr>
+        <w:t xml:space="preserve">.jpg | </w:t>
+      </w:r>
+      <w:r>
+        <w:rPr>
+          <w:rStyle w:val="SourceText"/>
+          <w:rFonts w:ascii="Times New Roman" w:hAnsi="Times New Roman"/>
+        </w:rPr>
+        <w:t>Sunrise</w:t>
+      </w:r>
+      <w:r>
+        <w:rPr>
+          <w:rStyle w:val="SourceText"/>
+          <w:rFonts w:ascii="Times New Roman" w:hAnsi="Times New Roman"/>
+        </w:rPr>
+        <w:t>]</w:t>
+      </w:r>
+      <w:r>
+        <w:rPr>
+          <w:rStyle w:val="SourceText"/>
+          <w:rFonts w:ascii="Times New Roman" w:hAnsi="Times New Roman"/>
+        </w:rPr>
+        <w:t>\n\n</w:t>
+      </w:r>
+    </w:p>
+    <w:p>
+      <w:pPr>
+        <w:pStyle w:val="BodyText"/>
+        <w:tabs>
+          <w:tab w:val="clear" w:pos="709"/>
+          <w:tab w:val="left" w:pos="0" w:leader="none"/>
+        </w:tabs>
+        <w:spacing w:lineRule="auto" w:line="240" w:before="0" w:after="0"/>
+        <w:ind w:hanging="283" w:start="709"/>
+        <w:rPr>
+          <w:rFonts w:ascii="Times New Roman" w:hAnsi="Times New Roman"/>
+        </w:rPr>
+      </w:pPr>
+      <w:r>
+        <w:rPr>
+          <w:rStyle w:val="SourceText"/>
+          <w:rFonts w:ascii="Times New Roman" w:hAnsi="Times New Roman"/>
+        </w:rPr>
+        <w:t>[</w:t>
+      </w:r>
+      <w:r>
+        <w:rPr>
+          <w:rStyle w:val="SourceText"/>
+          <w:rFonts w:ascii="Times New Roman" w:hAnsi="Times New Roman"/>
+        </w:rPr>
+        <w:t xml:space="preserve">photo: </w:t>
+      </w:r>
+      <w:r>
+        <w:rPr>
+          <w:rStyle w:val="SourceText"/>
+          <w:rFonts w:ascii="Times New Roman" w:hAnsi="Times New Roman"/>
+        </w:rPr>
+        <w:t>2026-0305-Megamalai-NCM-7786</w:t>
+      </w:r>
+      <w:r>
+        <w:rPr>
+          <w:rStyle w:val="SourceText"/>
+          <w:rFonts w:ascii="Times New Roman" w:hAnsi="Times New Roman"/>
+        </w:rPr>
+        <w:t xml:space="preserve">.jpg | </w:t>
+      </w:r>
+      <w:r>
+        <w:rPr>
+          <w:rStyle w:val="SourceText"/>
+          <w:rFonts w:ascii="Times New Roman" w:hAnsi="Times New Roman"/>
+        </w:rPr>
+        <w:t>Sunrise</w:t>
+      </w:r>
+      <w:r>
+        <w:rPr>
+          <w:rStyle w:val="SourceText"/>
+          <w:rFonts w:ascii="Times New Roman" w:hAnsi="Times New Roman"/>
+        </w:rPr>
+        <w:t>]</w:t>
+      </w:r>
+      <w:r>
+        <w:rPr>
+          <w:rStyle w:val="SourceText"/>
+          <w:rFonts w:ascii="Times New Roman" w:hAnsi="Times New Roman"/>
+        </w:rPr>
+        <w:t>\n\n</w:t>
+      </w:r>
+    </w:p>
+    <w:p>
+      <w:pPr>
+        <w:pStyle w:val="BodyText"/>
+        <w:tabs>
+          <w:tab w:val="clear" w:pos="709"/>
+          <w:tab w:val="left" w:pos="0" w:leader="none"/>
+        </w:tabs>
+        <w:spacing w:lineRule="auto" w:line="240" w:before="0" w:after="0"/>
+        <w:ind w:hanging="283" w:start="709"/>
+        <w:rPr>
+          <w:rFonts w:ascii="Times New Roman" w:hAnsi="Times New Roman"/>
+        </w:rPr>
+      </w:pPr>
+      <w:r>
+        <w:rPr>
+          <w:rStyle w:val="SourceText"/>
+          <w:rFonts w:ascii="Times New Roman" w:hAnsi="Times New Roman"/>
+        </w:rPr>
+        <w:t xml:space="preserve">[photo: 2026-0127-Megamalai-NCM-4628.jpg | </w:t>
+      </w:r>
+      <w:r>
+        <w:rPr>
+          <w:rStyle w:val="SourceText"/>
+          <w:rFonts w:ascii="Times New Roman" w:hAnsi="Times New Roman"/>
+        </w:rPr>
+        <w:t>Unfolding of the day</w:t>
+      </w:r>
+      <w:r>
+        <w:rPr>
+          <w:rStyle w:val="SourceText"/>
+          <w:rFonts w:ascii="Times New Roman" w:hAnsi="Times New Roman"/>
+        </w:rPr>
+        <w:t>]</w:t>
+      </w:r>
+      <w:r>
+        <w:rPr>
+          <w:rStyle w:val="SourceText"/>
+          <w:rFonts w:ascii="Times New Roman" w:hAnsi="Times New Roman"/>
+        </w:rPr>
+        <w:t>\n\n</w:t>
+      </w:r>
+    </w:p>
+    <w:p>
+      <w:pPr>
+        <w:pStyle w:val="BodyText"/>
+        <w:tabs>
+          <w:tab w:val="clear" w:pos="709"/>
+          <w:tab w:val="left" w:pos="0" w:leader="none"/>
+        </w:tabs>
+        <w:spacing w:lineRule="auto" w:line="240" w:before="0" w:after="0"/>
+        <w:ind w:hanging="283" w:start="709"/>
+        <w:rPr>
+          <w:rFonts w:ascii="Times New Roman" w:hAnsi="Times New Roman"/>
+        </w:rPr>
+      </w:pPr>
+      <w:r>
+        <w:rPr>
+          <w:rStyle w:val="SourceText"/>
+          <w:rFonts w:ascii="Times New Roman" w:hAnsi="Times New Roman"/>
+        </w:rPr>
+        <w:t>[photo: 2026-0127-Megamalai-NCM-46</w:t>
+      </w:r>
+      <w:r>
+        <w:rPr>
+          <w:rStyle w:val="SourceText"/>
+          <w:rFonts w:ascii="Times New Roman" w:hAnsi="Times New Roman"/>
+        </w:rPr>
+        <w:t>77</w:t>
+      </w:r>
+      <w:r>
+        <w:rPr>
+          <w:rStyle w:val="SourceText"/>
+          <w:rFonts w:ascii="Times New Roman" w:hAnsi="Times New Roman"/>
+        </w:rPr>
+        <w:t xml:space="preserve">.jpg | </w:t>
+      </w:r>
+      <w:r>
+        <w:rPr>
+          <w:rStyle w:val="SourceText"/>
+          <w:rFonts w:ascii="Times New Roman" w:hAnsi="Times New Roman"/>
+        </w:rPr>
+        <w:t>Golden Hours</w:t>
+      </w:r>
+      <w:r>
+        <w:rPr>
+          <w:rStyle w:val="SourceText"/>
+          <w:rFonts w:ascii="Times New Roman" w:hAnsi="Times New Roman"/>
+        </w:rPr>
+        <w:t>]</w:t>
+      </w:r>
+      <w:r>
+        <w:rPr>
+          <w:rStyle w:val="SourceText"/>
+          <w:rFonts w:ascii="Times New Roman" w:hAnsi="Times New Roman"/>
+        </w:rPr>
+        <w:t>\n\n</w:t>
+      </w:r>
+    </w:p>
+    <w:p>
+      <w:pPr>
+        <w:pStyle w:val="BodyText"/>
+        <w:tabs>
+          <w:tab w:val="clear" w:pos="709"/>
+          <w:tab w:val="left" w:pos="0" w:leader="none"/>
+        </w:tabs>
+        <w:spacing w:lineRule="auto" w:line="240" w:before="0" w:after="0"/>
+        <w:ind w:hanging="283" w:start="709"/>
+        <w:rPr>
+          <w:rFonts w:ascii="Times New Roman" w:hAnsi="Times New Roman"/>
+        </w:rPr>
+      </w:pPr>
+      <w:r>
+        <w:rPr>
+          <w:rStyle w:val="SourceText"/>
+          <w:rFonts w:ascii="Times New Roman" w:hAnsi="Times New Roman"/>
+        </w:rPr>
+        <w:t>[photo: 2026-0127-Megamalai-NCM-46</w:t>
+      </w:r>
+      <w:r>
+        <w:rPr>
+          <w:rStyle w:val="SourceText"/>
+          <w:rFonts w:ascii="Times New Roman" w:hAnsi="Times New Roman"/>
+        </w:rPr>
+        <w:t>56-58</w:t>
+      </w:r>
+      <w:r>
+        <w:rPr>
+          <w:rStyle w:val="SourceText"/>
+          <w:rFonts w:ascii="Times New Roman" w:hAnsi="Times New Roman"/>
+        </w:rPr>
+        <w:t xml:space="preserve">.jpg | </w:t>
+      </w:r>
+      <w:r>
+        <w:rPr>
+          <w:rStyle w:val="SourceText"/>
+          <w:rFonts w:ascii="Times New Roman" w:hAnsi="Times New Roman"/>
+        </w:rPr>
+        <w:t>View of the Valley</w:t>
+      </w:r>
+      <w:r>
+        <w:rPr>
+          <w:rStyle w:val="SourceText"/>
+          <w:rFonts w:ascii="Times New Roman" w:hAnsi="Times New Roman"/>
+        </w:rPr>
+        <w:t>]</w:t>
+      </w:r>
+      <w:r>
+        <w:rPr>
+          <w:rStyle w:val="SourceText"/>
+          <w:rFonts w:ascii="Times New Roman" w:hAnsi="Times New Roman"/>
+        </w:rPr>
+        <w:t>\n\n</w:t>
+      </w:r>
+    </w:p>
+    <w:p>
+      <w:pPr>
+        <w:pStyle w:val="BodyText"/>
+        <w:tabs>
+          <w:tab w:val="clear" w:pos="709"/>
+          <w:tab w:val="left" w:pos="0" w:leader="none"/>
+        </w:tabs>
+        <w:spacing w:lineRule="auto" w:line="240" w:before="0" w:after="0"/>
+        <w:ind w:hanging="283" w:start="709"/>
+        <w:rPr>
+          <w:rFonts w:ascii="Times New Roman" w:hAnsi="Times New Roman"/>
+        </w:rPr>
+      </w:pPr>
+      <w:r>
+        <w:rPr>
+          <w:rStyle w:val="SourceText"/>
+          <w:rFonts w:ascii="Times New Roman" w:hAnsi="Times New Roman"/>
+        </w:rPr>
+        <w:t>[photo: 2026-0127-Megamalai-NCM-4</w:t>
+      </w:r>
+      <w:r>
+        <w:rPr>
+          <w:rStyle w:val="SourceText"/>
+          <w:rFonts w:ascii="Times New Roman" w:hAnsi="Times New Roman"/>
+        </w:rPr>
+        <w:t>855</w:t>
+      </w:r>
+      <w:r>
+        <w:rPr>
+          <w:rStyle w:val="SourceText"/>
+          <w:rFonts w:ascii="Times New Roman" w:hAnsi="Times New Roman"/>
+        </w:rPr>
+        <w:t xml:space="preserve">.jpg | </w:t>
+      </w:r>
+      <w:r>
+        <w:rPr>
+          <w:rStyle w:val="SourceText"/>
+          <w:rFonts w:ascii="Times New Roman" w:hAnsi="Times New Roman"/>
+        </w:rPr>
+        <w:t>Beauty in Contrast</w:t>
+      </w:r>
+      <w:r>
+        <w:rPr>
+          <w:rStyle w:val="SourceText"/>
+          <w:rFonts w:ascii="Times New Roman" w:hAnsi="Times New Roman"/>
+        </w:rPr>
+        <w:t>]</w:t>
+      </w:r>
+      <w:r>
+        <w:rPr>
+          <w:rStyle w:val="SourceText"/>
+          <w:rFonts w:ascii="Times New Roman" w:hAnsi="Times New Roman"/>
+        </w:rPr>
+        <w:t>\n\n</w:t>
+      </w:r>
+    </w:p>
+    <w:p>
+      <w:pPr>
+        <w:pStyle w:val="BodyText"/>
+        <w:tabs>
+          <w:tab w:val="clear" w:pos="709"/>
+          <w:tab w:val="left" w:pos="0" w:leader="none"/>
+        </w:tabs>
+        <w:spacing w:lineRule="auto" w:line="240" w:before="0" w:after="0"/>
+        <w:ind w:hanging="283" w:start="709"/>
+        <w:rPr>
+          <w:rFonts w:ascii="Times New Roman" w:hAnsi="Times New Roman"/>
+        </w:rPr>
+      </w:pPr>
+      <w:r>
+        <w:rPr>
+          <w:rStyle w:val="SourceText"/>
+          <w:rFonts w:ascii="Times New Roman" w:hAnsi="Times New Roman"/>
+        </w:rPr>
+        <w:t>[photo: 2026-0127-Megamalai-NCM-4</w:t>
+      </w:r>
+      <w:r>
+        <w:rPr>
+          <w:rStyle w:val="SourceText"/>
+          <w:rFonts w:ascii="Times New Roman" w:hAnsi="Times New Roman"/>
+        </w:rPr>
+        <w:t>865-69</w:t>
+      </w:r>
+      <w:r>
+        <w:rPr>
+          <w:rStyle w:val="SourceText"/>
+          <w:rFonts w:ascii="Times New Roman" w:hAnsi="Times New Roman"/>
+        </w:rPr>
+        <w:t xml:space="preserve">.jpg | </w:t>
+      </w:r>
+      <w:r>
+        <w:rPr>
+          <w:rStyle w:val="SourceText"/>
+          <w:rFonts w:ascii="Times New Roman" w:hAnsi="Times New Roman"/>
+        </w:rPr>
+        <w:t>Lake View</w:t>
+      </w:r>
+      <w:r>
+        <w:rPr>
+          <w:rStyle w:val="SourceText"/>
+          <w:rFonts w:ascii="Times New Roman" w:hAnsi="Times New Roman"/>
+        </w:rPr>
+        <w:t>]</w:t>
+      </w:r>
+      <w:r>
+        <w:rPr>
+          <w:rStyle w:val="SourceText"/>
+          <w:rFonts w:ascii="Times New Roman" w:hAnsi="Times New Roman"/>
+        </w:rPr>
+        <w:t>\n\n</w:t>
+      </w:r>
+    </w:p>
+    <w:p>
+      <w:pPr>
+        <w:pStyle w:val="BodyText"/>
+        <w:tabs>
+          <w:tab w:val="clear" w:pos="709"/>
+          <w:tab w:val="left" w:pos="0" w:leader="none"/>
+        </w:tabs>
+        <w:spacing w:lineRule="auto" w:line="240" w:before="0" w:after="0"/>
+        <w:ind w:hanging="283" w:start="709"/>
+        <w:rPr>
+          <w:rFonts w:ascii="Times New Roman" w:hAnsi="Times New Roman"/>
+        </w:rPr>
+      </w:pPr>
+      <w:r>
+        <w:rPr>
+          <w:rStyle w:val="SourceText"/>
+          <w:rFonts w:ascii="Times New Roman" w:hAnsi="Times New Roman"/>
+        </w:rPr>
+        <w:t>[</w:t>
+      </w:r>
+      <w:r>
+        <w:rPr>
+          <w:rStyle w:val="SourceText"/>
+          <w:rFonts w:ascii="Times New Roman" w:hAnsi="Times New Roman"/>
+        </w:rPr>
+        <w:t xml:space="preserve">photo: </w:t>
+      </w:r>
+      <w:r>
+        <w:rPr>
+          <w:rStyle w:val="SourceText"/>
+          <w:rFonts w:ascii="Times New Roman" w:hAnsi="Times New Roman"/>
+        </w:rPr>
+        <w:t>2026-0305-Megamalai-NCM-7728-30</w:t>
+      </w:r>
+      <w:r>
+        <w:rPr>
+          <w:rStyle w:val="SourceText"/>
+          <w:rFonts w:ascii="Times New Roman" w:hAnsi="Times New Roman"/>
+        </w:rPr>
+        <w:t xml:space="preserve">.jpg | </w:t>
+      </w:r>
+      <w:r>
+        <w:rPr>
+          <w:rStyle w:val="SourceText"/>
+          <w:rFonts w:ascii="Times New Roman" w:hAnsi="Times New Roman"/>
+        </w:rPr>
+        <w:t>Highways Village</w:t>
+      </w:r>
+      <w:r>
+        <w:rPr>
+          <w:rStyle w:val="SourceText"/>
+          <w:rFonts w:ascii="Times New Roman" w:hAnsi="Times New Roman"/>
+        </w:rPr>
+        <w:t>]</w:t>
+      </w:r>
+      <w:r>
+        <w:rPr>
+          <w:rStyle w:val="SourceText"/>
+          <w:rFonts w:ascii="Times New Roman" w:hAnsi="Times New Roman"/>
+        </w:rPr>
+        <w:t>\n\n</w:t>
+      </w:r>
+    </w:p>
+    <w:p>
+      <w:pPr>
+        <w:pStyle w:val="BodyText"/>
+        <w:tabs>
+          <w:tab w:val="clear" w:pos="709"/>
+          <w:tab w:val="left" w:pos="0" w:leader="none"/>
+        </w:tabs>
+        <w:spacing w:lineRule="auto" w:line="240" w:before="0" w:after="0"/>
+        <w:ind w:hanging="283" w:start="709"/>
+        <w:rPr>
+          <w:rFonts w:ascii="Times New Roman" w:hAnsi="Times New Roman"/>
+        </w:rPr>
+      </w:pPr>
+      <w:r>
+        <w:rPr>
+          <w:rStyle w:val="SourceText"/>
+          <w:rFonts w:ascii="Times New Roman" w:hAnsi="Times New Roman"/>
+        </w:rPr>
+        <w:t>[</w:t>
+      </w:r>
+      <w:r>
+        <w:rPr>
+          <w:rStyle w:val="SourceText"/>
+          <w:rFonts w:ascii="Times New Roman" w:hAnsi="Times New Roman"/>
+        </w:rPr>
+        <w:t xml:space="preserve">photo: </w:t>
+      </w:r>
+      <w:r>
+        <w:rPr>
+          <w:rStyle w:val="SourceText"/>
+          <w:rFonts w:ascii="Times New Roman" w:hAnsi="Times New Roman"/>
+        </w:rPr>
+        <w:t>2026-0</w:t>
+      </w:r>
+      <w:r>
+        <w:rPr>
+          <w:rStyle w:val="SourceText"/>
+          <w:rFonts w:ascii="Times New Roman" w:hAnsi="Times New Roman"/>
+        </w:rPr>
+        <w:t>127</w:t>
+      </w:r>
+      <w:r>
+        <w:rPr>
+          <w:rStyle w:val="SourceText"/>
+          <w:rFonts w:ascii="Times New Roman" w:hAnsi="Times New Roman"/>
+        </w:rPr>
+        <w:t>-Megamalai-NCM-</w:t>
+      </w:r>
+      <w:r>
+        <w:rPr>
+          <w:rStyle w:val="SourceText"/>
+          <w:rFonts w:ascii="Times New Roman" w:hAnsi="Times New Roman"/>
+        </w:rPr>
+        <w:t>4793</w:t>
+      </w:r>
+      <w:r>
+        <w:rPr>
+          <w:rStyle w:val="SourceText"/>
+          <w:rFonts w:ascii="Times New Roman" w:hAnsi="Times New Roman"/>
+        </w:rPr>
+        <w:t xml:space="preserve">.jpg | </w:t>
+      </w:r>
+      <w:r>
+        <w:rPr>
+          <w:rStyle w:val="SourceText"/>
+          <w:rFonts w:ascii="Times New Roman" w:hAnsi="Times New Roman"/>
+        </w:rPr>
+        <w:t>Village and the Church</w:t>
+      </w:r>
+      <w:r>
+        <w:rPr>
+          <w:rStyle w:val="SourceText"/>
+          <w:rFonts w:ascii="Times New Roman" w:hAnsi="Times New Roman"/>
+        </w:rPr>
+        <w:t>]\n\n</w:t>
+      </w:r>
+    </w:p>
+    <w:p>
+      <w:pPr>
+        <w:pStyle w:val="BodyText"/>
+        <w:tabs>
+          <w:tab w:val="clear" w:pos="709"/>
+          <w:tab w:val="left" w:pos="0" w:leader="none"/>
+        </w:tabs>
+        <w:spacing w:lineRule="auto" w:line="240" w:before="0" w:after="0"/>
+        <w:ind w:hanging="283" w:start="709"/>
+        <w:rPr>
+          <w:rFonts w:ascii="Times New Roman" w:hAnsi="Times New Roman"/>
+        </w:rPr>
+      </w:pPr>
+      <w:r>
+        <w:rPr>
+          <w:rStyle w:val="SourceText"/>
+          <w:rFonts w:ascii="Times New Roman" w:hAnsi="Times New Roman"/>
+        </w:rPr>
+        <w:t>[</w:t>
+      </w:r>
+      <w:r>
+        <w:rPr>
+          <w:rStyle w:val="SourceText"/>
+          <w:rFonts w:ascii="Times New Roman" w:hAnsi="Times New Roman"/>
+        </w:rPr>
+        <w:t xml:space="preserve">photo: </w:t>
+      </w:r>
+      <w:r>
+        <w:rPr>
+          <w:rStyle w:val="SourceText"/>
+          <w:rFonts w:ascii="Times New Roman" w:hAnsi="Times New Roman"/>
+        </w:rPr>
+        <w:t>2026-0305-Megamalai-NCM-7779</w:t>
+      </w:r>
+      <w:r>
+        <w:rPr>
+          <w:rStyle w:val="SourceText"/>
+          <w:rFonts w:ascii="Times New Roman" w:hAnsi="Times New Roman"/>
+        </w:rPr>
+        <w:t xml:space="preserve">.jpg | </w:t>
+      </w:r>
+      <w:r>
+        <w:rPr>
+          <w:rStyle w:val="SourceText"/>
+          <w:rFonts w:ascii="Times New Roman" w:hAnsi="Times New Roman"/>
+        </w:rPr>
+        <w:t>Lonely Villager</w:t>
+      </w:r>
+      <w:r>
+        <w:rPr>
+          <w:rStyle w:val="SourceText"/>
+          <w:rFonts w:ascii="Times New Roman" w:hAnsi="Times New Roman"/>
+        </w:rPr>
+        <w:t>]</w:t>
+      </w:r>
+      <w:r>
+        <w:rPr>
+          <w:rStyle w:val="SourceText"/>
+          <w:rFonts w:ascii="Times New Roman" w:hAnsi="Times New Roman"/>
+        </w:rPr>
+        <w:t>\n\n</w:t>
+      </w:r>
+    </w:p>
+    <w:p>
+      <w:pPr>
+        <w:pStyle w:val="BodyText"/>
+        <w:tabs>
+          <w:tab w:val="clear" w:pos="709"/>
+          <w:tab w:val="left" w:pos="0" w:leader="none"/>
+        </w:tabs>
+        <w:spacing w:lineRule="auto" w:line="240" w:before="0" w:after="0"/>
+        <w:ind w:hanging="283" w:start="709"/>
+        <w:rPr>
+          <w:rFonts w:ascii="Times New Roman" w:hAnsi="Times New Roman"/>
+        </w:rPr>
+      </w:pPr>
+      <w:r>
+        <w:rPr>
+          <w:rStyle w:val="SourceText"/>
+          <w:rFonts w:ascii="Times New Roman" w:hAnsi="Times New Roman"/>
+        </w:rPr>
+        <w:t>[</w:t>
+      </w:r>
+      <w:r>
+        <w:rPr>
+          <w:rStyle w:val="SourceText"/>
+          <w:rFonts w:ascii="Times New Roman" w:hAnsi="Times New Roman"/>
+        </w:rPr>
+        <w:t xml:space="preserve">photo: </w:t>
+      </w:r>
+      <w:r>
+        <w:rPr>
+          <w:rStyle w:val="SourceText"/>
+          <w:rFonts w:ascii="Times New Roman" w:hAnsi="Times New Roman"/>
+        </w:rPr>
+        <w:t>2026-0</w:t>
+      </w:r>
+      <w:r>
+        <w:rPr>
+          <w:rStyle w:val="SourceText"/>
+          <w:rFonts w:ascii="Times New Roman" w:hAnsi="Times New Roman"/>
+        </w:rPr>
+        <w:t>127</w:t>
+      </w:r>
+      <w:r>
+        <w:rPr>
+          <w:rStyle w:val="SourceText"/>
+          <w:rFonts w:ascii="Times New Roman" w:hAnsi="Times New Roman"/>
+        </w:rPr>
+        <w:t>-Megamalai-NCM-</w:t>
+      </w:r>
+      <w:r>
+        <w:rPr>
+          <w:rStyle w:val="SourceText"/>
+          <w:rFonts w:ascii="Times New Roman" w:hAnsi="Times New Roman"/>
+        </w:rPr>
+        <w:t>4860</w:t>
+      </w:r>
+      <w:r>
+        <w:rPr>
+          <w:rStyle w:val="SourceText"/>
+          <w:rFonts w:ascii="Times New Roman" w:hAnsi="Times New Roman"/>
+        </w:rPr>
+        <w:t xml:space="preserve">.jpg | </w:t>
+      </w:r>
+      <w:r>
+        <w:rPr>
+          <w:rStyle w:val="SourceText"/>
+          <w:rFonts w:ascii="Times New Roman" w:hAnsi="Times New Roman"/>
+        </w:rPr>
+        <w:t>Suruliyaru River</w:t>
+      </w:r>
+      <w:r>
+        <w:rPr>
+          <w:rStyle w:val="SourceText"/>
+          <w:rFonts w:ascii="Times New Roman" w:hAnsi="Times New Roman"/>
+        </w:rPr>
+        <w:t>]\n\n</w:t>
+      </w:r>
+    </w:p>
+    <w:p>
+      <w:pPr>
+        <w:pStyle w:val="BodyText"/>
+        <w:tabs>
+          <w:tab w:val="clear" w:pos="709"/>
+          <w:tab w:val="left" w:pos="0" w:leader="none"/>
+        </w:tabs>
+        <w:spacing w:lineRule="auto" w:line="240" w:before="0" w:after="0"/>
+        <w:ind w:hanging="283" w:start="709"/>
+        <w:rPr>
+          <w:rFonts w:ascii="Times New Roman" w:hAnsi="Times New Roman"/>
+        </w:rPr>
+      </w:pPr>
+      <w:r>
+        <w:rPr>
+          <w:rFonts w:ascii="Times New Roman" w:hAnsi="Times New Roman"/>
+        </w:rPr>
+      </w:r>
+    </w:p>
+    <w:p>
+      <w:pPr>
+        <w:pStyle w:val="BodyText"/>
+        <w:spacing w:lineRule="auto" w:line="240"/>
+        <w:rPr>
+          <w:rFonts w:ascii="Times New Roman" w:hAnsi="Times New Roman"/>
+        </w:rPr>
+      </w:pPr>
+      <w:r>
+        <w:rPr>
+          <w:rFonts w:ascii="Times New Roman" w:hAnsi="Times New Roman"/>
+        </w:rPr>
+        <w:t>A few notes:</w:t>
+      </w:r>
+    </w:p>
+    <w:p>
+      <w:pPr>
+        <w:pStyle w:val="BodyText"/>
+        <w:numPr>
+          <w:ilvl w:val="0"/>
+          <w:numId w:val="1"/>
+        </w:numPr>
+        <w:tabs>
+          <w:tab w:val="clear" w:pos="709"/>
+          <w:tab w:val="left" w:pos="0" w:leader="none"/>
+        </w:tabs>
+        <w:spacing w:lineRule="auto" w:line="240" w:before="0" w:after="0"/>
+        <w:ind w:hanging="283" w:start="709"/>
+        <w:rPr>
+          <w:rFonts w:ascii="Times New Roman" w:hAnsi="Times New Roman"/>
+        </w:rPr>
+      </w:pPr>
+      <w:r>
+        <w:rPr>
+          <w:rFonts w:ascii="Times New Roman" w:hAnsi="Times New Roman"/>
+        </w:rPr>
+        <w:t xml:space="preserve">Every </w:t>
+      </w:r>
+      <w:r>
+        <w:rPr>
+          <w:rStyle w:val="SourceText"/>
+          <w:rFonts w:ascii="Times New Roman" w:hAnsi="Times New Roman"/>
+        </w:rPr>
+        <w:t>##</w:t>
+      </w:r>
+      <w:r>
+        <w:rPr>
+          <w:rFonts w:ascii="Times New Roman" w:hAnsi="Times New Roman"/>
+        </w:rPr>
+        <w:t xml:space="preserve"> line becomes a </w:t>
+      </w:r>
+      <w:r>
+        <w:rPr>
+          <w:rStyle w:val="Strong"/>
+          <w:rFonts w:ascii="Times New Roman" w:hAnsi="Times New Roman"/>
+        </w:rPr>
+        <w:t>bold subheading</w:t>
+      </w:r>
+      <w:r>
+        <w:rPr>
+          <w:rFonts w:ascii="Times New Roman" w:hAnsi="Times New Roman"/>
+        </w:rPr>
+        <w:t xml:space="preserve"> in the rendered post (via the </w:t>
+      </w:r>
+      <w:r>
+        <w:rPr>
+          <w:rStyle w:val="SourceText"/>
+          <w:rFonts w:ascii="Times New Roman" w:hAnsi="Times New Roman"/>
+        </w:rPr>
+        <w:t>.story-body h2</w:t>
+      </w:r>
+      <w:r>
+        <w:rPr>
+          <w:rFonts w:ascii="Times New Roman" w:hAnsi="Times New Roman"/>
+        </w:rPr>
+        <w:t xml:space="preserve"> style already in your CSS) </w:t>
+      </w:r>
+    </w:p>
+    <w:p>
+      <w:pPr>
+        <w:pStyle w:val="BodyText"/>
+        <w:numPr>
+          <w:ilvl w:val="0"/>
+          <w:numId w:val="1"/>
+        </w:numPr>
+        <w:tabs>
+          <w:tab w:val="clear" w:pos="709"/>
+          <w:tab w:val="left" w:pos="0" w:leader="none"/>
+        </w:tabs>
+        <w:spacing w:lineRule="auto" w:line="240" w:before="0" w:after="0"/>
+        <w:ind w:hanging="283" w:start="709"/>
+        <w:rPr>
+          <w:rFonts w:ascii="Times New Roman" w:hAnsi="Times New Roman"/>
+        </w:rPr>
+      </w:pPr>
+      <w:r>
+        <w:rPr>
+          <w:rFonts w:ascii="Times New Roman" w:hAnsi="Times New Roman"/>
+        </w:rPr>
+        <w:t xml:space="preserve">Blank lines between paragraphs become separate </w:t>
+      </w:r>
+      <w:r>
+        <w:rPr>
+          <w:rStyle w:val="SourceText"/>
+          <w:rFonts w:ascii="Times New Roman" w:hAnsi="Times New Roman"/>
+        </w:rPr>
+        <w:t>&lt;p&gt;</w:t>
+      </w:r>
+      <w:r>
+        <w:rPr>
+          <w:rFonts w:ascii="Times New Roman" w:hAnsi="Times New Roman"/>
+        </w:rPr>
+        <w:t xml:space="preserve"> tags </w:t>
+      </w:r>
+    </w:p>
+    <w:p>
+      <w:pPr>
+        <w:pStyle w:val="BodyText"/>
+        <w:numPr>
+          <w:ilvl w:val="0"/>
+          <w:numId w:val="1"/>
+        </w:numPr>
+        <w:tabs>
+          <w:tab w:val="clear" w:pos="709"/>
+          <w:tab w:val="left" w:pos="0" w:leader="none"/>
+        </w:tabs>
+        <w:spacing w:lineRule="auto" w:line="240" w:before="0" w:after="0"/>
+        <w:ind w:hanging="283" w:start="709"/>
+        <w:rPr>
+          <w:rFonts w:ascii="Times New Roman" w:hAnsi="Times New Roman"/>
+        </w:rPr>
+      </w:pPr>
+      <w:r>
+        <w:rPr>
+          <w:rFonts w:ascii="Times New Roman" w:hAnsi="Times New Roman"/>
+        </w:rPr>
+        <w:t xml:space="preserve">If you want to embed photos inline anywhere, add </w:t>
+      </w:r>
+      <w:r>
+        <w:rPr>
+          <w:rStyle w:val="SourceText"/>
+          <w:rFonts w:ascii="Times New Roman" w:hAnsi="Times New Roman"/>
+        </w:rPr>
+        <w:t>[photo: filename.jpg | Optional caption]</w:t>
+      </w:r>
+      <w:r>
+        <w:rPr>
+          <w:rFonts w:ascii="Times New Roman" w:hAnsi="Times New Roman"/>
+        </w:rPr>
+        <w:t xml:space="preserve"> on its own line — the script will resolve it to a clickable grid item </w:t>
+      </w:r>
+    </w:p>
+    <w:p>
+      <w:pPr>
+        <w:pStyle w:val="BodyText"/>
+        <w:numPr>
+          <w:ilvl w:val="0"/>
+          <w:numId w:val="1"/>
+        </w:numPr>
+        <w:tabs>
+          <w:tab w:val="clear" w:pos="709"/>
+          <w:tab w:val="left" w:pos="0" w:leader="none"/>
+        </w:tabs>
+        <w:spacing w:lineRule="auto" w:line="240"/>
+        <w:ind w:hanging="283" w:start="709"/>
+        <w:rPr>
+          <w:rFonts w:ascii="Times New Roman" w:hAnsi="Times New Roman"/>
+        </w:rPr>
+      </w:pPr>
+      <w:r>
+        <w:rPr>
+          <w:rFonts w:ascii="Times New Roman" w:hAnsi="Times New Roman"/>
+        </w:rPr>
+        <w:t xml:space="preserve">The </w:t>
+      </w:r>
+      <w:r>
+        <w:rPr>
+          <w:rStyle w:val="SourceText"/>
+          <w:rFonts w:ascii="Times New Roman" w:hAnsi="Times New Roman"/>
+        </w:rPr>
+        <w:t>place_tag: "Megamalai"</w:t>
+      </w:r>
+      <w:r>
+        <w:rPr>
+          <w:rFonts w:ascii="Times New Roman" w:hAnsi="Times New Roman"/>
+        </w:rPr>
+        <w:t xml:space="preserve"> will wire up the "View Photos from Megamalai" CTA button at the bottom of the post, pulling all photos tagged with that city </w:t>
+      </w:r>
+    </w:p>
+    <w:p>
+      <w:pPr>
+        <w:pStyle w:val="Normal"/>
+        <w:bidi w:val="0"/>
+        <w:spacing w:lineRule="auto" w:line="240" w:before="0" w:after="0"/>
+        <w:jc w:val="start"/>
+        <w:rPr>
+          <w:rFonts w:ascii="Times New Roman" w:hAnsi="Times New Roman"/>
+          <w:sz w:val="24"/>
+          <w:szCs w:val="24"/>
+        </w:rPr>
+      </w:pPr>
+      <w:r>
+        <w:rPr>
+          <w:rFonts w:ascii="Times New Roman" w:hAnsi="Times New Roman"/>
+          <w:sz w:val="24"/>
+          <w:szCs w:val="24"/>
+        </w:rPr>
+      </w:r>
+    </w:p>
+    <w:p>
+      <w:pPr>
         <w:pStyle w:val="Normal"/>
         <w:bidi w:val="0"/>
         <w:spacing w:lineRule="auto" w:line="240" w:before="0" w:after="0"/>
@@ -118,23 +1686,7 @@
           <w:sz w:val="24"/>
           <w:szCs w:val="24"/>
         </w:rPr>
-        <w:t xml:space="preserve">By late morning, around 11:30 am, my friend called again, this time with good news. His mother was better and back home. What followed was even more surprising: he asked if we could still go ahead with the trip. The reasons were practical and relatable. </w:t>
-      </w:r>
-      <w:r>
-        <w:rPr>
-          <w:rFonts w:ascii="Times New Roman" w:hAnsi="Times New Roman"/>
-          <w:sz w:val="24"/>
-          <w:szCs w:val="24"/>
-        </w:rPr>
-        <w:t>A</w:t>
-      </w:r>
-      <w:r>
-        <w:rPr>
-          <w:rFonts w:ascii="Times New Roman" w:hAnsi="Times New Roman"/>
-          <w:sz w:val="24"/>
-          <w:szCs w:val="24"/>
-        </w:rPr>
-        <w:t>dvance payments would be lost, and both of us were in desperate need of a break from routine ;-)</w:t>
+        <w:t>By late morning, around 11:30 am, my friend called again, this time with good news. His mother was better and back home. What followed was even more surprising: he asked if we could still go ahead with the trip. The reasons were practical and relatable. Advance payments would be lost, and both of us were in desperate need of a break from routine ;-)</w:t>
       </w:r>
     </w:p>
     <w:p>
@@ -711,15 +2263,7 @@
           <w:sz w:val="24"/>
           <w:szCs w:val="24"/>
         </w:rPr>
-        <w:t xml:space="preserve">. </w:t>
-      </w:r>
-      <w:r>
-        <w:rPr>
-          <w:rFonts w:ascii="Times New Roman" w:hAnsi="Times New Roman"/>
-          <w:sz w:val="24"/>
-          <w:szCs w:val="24"/>
-        </w:rPr>
-        <w:t>It was dawn, and our eyes were fixed on the eastern horizon, waiting for the sunrise. The light was faint, and visibility was low at first. Gradually, as our eyes adjusted, we noticed a vast valley opening up before us, and hints of golden hues began to emerge.</w:t>
+        <w:t>. It was dawn, and our eyes were fixed on the eastern horizon, waiting for the sunrise. The light was faint, and visibility was low at first. Gradually, as our eyes adjusted, we noticed a vast valley opening up before us, and hints of golden hues began to emerge.</w:t>
       </w:r>
     </w:p>
     <w:p>
@@ -1028,7 +2572,11 @@
         </w:rPr>
       </w:pPr>
       <w:r>
-        <w:rPr/>
+        <w:rPr>
+          <w:rFonts w:ascii="Times New Roman" w:hAnsi="Times New Roman"/>
+          <w:sz w:val="24"/>
+          <w:szCs w:val="24"/>
+        </w:rPr>
       </w:r>
     </w:p>
     <w:p>
@@ -1071,173 +2619,174 @@
         </w:rPr>
       </w:pPr>
       <w:r>
-        <w:rPr/>
-      </w:r>
-    </w:p>
-    <w:p>
-      <w:pPr>
-        <w:pStyle w:val="BodyText"/>
-        <w:bidi w:val="0"/>
-        <w:spacing w:lineRule="auto" w:line="240" w:before="0" w:after="0"/>
-        <w:jc w:val="start"/>
         <w:rPr>
           <w:rFonts w:ascii="Times New Roman" w:hAnsi="Times New Roman"/>
           <w:b/>
           <w:bCs/>
-          <w:sz w:val="24"/>
-        </w:rPr>
-      </w:pPr>
-      <w:r>
-        <w:rPr>
-          <w:rFonts w:ascii="Times New Roman" w:hAnsi="Times New Roman"/>
-          <w:b w:val="false"/>
-          <w:bCs w:val="false"/>
-        </w:rPr>
-        <w:t xml:space="preserve">From the valley view, we drove up the hills and reached the main village, </w:t>
-      </w:r>
-      <w:r>
-        <w:rPr>
-          <w:rStyle w:val="Emphasis"/>
-          <w:rFonts w:ascii="Times New Roman" w:hAnsi="Times New Roman"/>
-          <w:b w:val="false"/>
-          <w:bCs w:val="false"/>
-        </w:rPr>
-        <w:t>Highways Panchayat</w:t>
-      </w:r>
-      <w:r>
-        <w:rPr>
-          <w:rFonts w:ascii="Times New Roman" w:hAnsi="Times New Roman"/>
-          <w:b w:val="false"/>
-          <w:bCs w:val="false"/>
-        </w:rPr>
-        <w:t>. Surprisingly, the Panchayat maintains a guest house with about 10 rooms. We noticed that some families were staying there. The guest house is located very close to the Highways Reservoir/Dam, and there was plenty of water in the reservoir.</w:t>
-      </w:r>
-    </w:p>
-    <w:p>
-      <w:pPr>
-        <w:pStyle w:val="BodyText"/>
-        <w:bidi w:val="0"/>
-        <w:spacing w:lineRule="auto" w:line="240" w:before="0" w:after="0"/>
-        <w:jc w:val="start"/>
-        <w:rPr>
-          <w:rFonts w:ascii="Times New Roman" w:hAnsi="Times New Roman"/>
-          <w:b w:val="false"/>
-          <w:bCs w:val="false"/>
-          <w:sz w:val="24"/>
-        </w:rPr>
-      </w:pPr>
-      <w:r>
-        <w:rPr>
-          <w:rFonts w:ascii="Times New Roman" w:hAnsi="Times New Roman"/>
-          <w:b w:val="false"/>
-          <w:bCs w:val="false"/>
-        </w:rPr>
-      </w:r>
-    </w:p>
-    <w:p>
-      <w:pPr>
-        <w:pStyle w:val="BodyText"/>
-        <w:bidi w:val="0"/>
-        <w:spacing w:lineRule="auto" w:line="240" w:before="0" w:after="0"/>
-        <w:jc w:val="start"/>
-        <w:rPr>
-          <w:rFonts w:ascii="Times New Roman" w:hAnsi="Times New Roman"/>
-          <w:b w:val="false"/>
-          <w:bCs w:val="false"/>
-          <w:sz w:val="24"/>
-        </w:rPr>
-      </w:pPr>
-      <w:r>
-        <w:rPr>
-          <w:rFonts w:ascii="Times New Roman" w:hAnsi="Times New Roman"/>
-          <w:b w:val="false"/>
-          <w:bCs w:val="false"/>
-        </w:rPr>
-        <w:t>I reached out to the guest house in charge to get the contact information. Strangely, I never bothered to look at the rooms :-( Yes, you guessed it. This has to do with something that happened two months after this trip!</w:t>
-      </w:r>
-    </w:p>
-    <w:p>
-      <w:pPr>
-        <w:pStyle w:val="BodyText"/>
-        <w:bidi w:val="0"/>
-        <w:spacing w:lineRule="auto" w:line="240" w:before="0" w:after="0"/>
-        <w:jc w:val="start"/>
-        <w:rPr>
-          <w:rFonts w:ascii="Times New Roman" w:hAnsi="Times New Roman"/>
-          <w:b w:val="false"/>
-          <w:bCs w:val="false"/>
-          <w:sz w:val="24"/>
-        </w:rPr>
-      </w:pPr>
-      <w:r>
-        <w:rPr>
-          <w:rFonts w:ascii="Times New Roman" w:hAnsi="Times New Roman"/>
-          <w:b w:val="false"/>
-          <w:bCs w:val="false"/>
-        </w:rPr>
-      </w:r>
-    </w:p>
-    <w:p>
-      <w:pPr>
-        <w:pStyle w:val="BodyText"/>
-        <w:bidi w:val="0"/>
-        <w:spacing w:lineRule="auto" w:line="240" w:before="0" w:after="0"/>
-        <w:jc w:val="start"/>
-        <w:rPr>
-          <w:rFonts w:ascii="Times New Roman" w:hAnsi="Times New Roman"/>
-          <w:b w:val="false"/>
-          <w:bCs w:val="false"/>
-          <w:sz w:val="24"/>
-        </w:rPr>
-      </w:pPr>
-      <w:r>
-        <w:rPr>
-          <w:rFonts w:ascii="Times New Roman" w:hAnsi="Times New Roman"/>
-          <w:b w:val="false"/>
-          <w:bCs w:val="false"/>
-        </w:rPr>
-        <w:t>By the way, there is no other place to stay in the entire Megamalai unless you have contacts within the tea estates to use their premises.</w:t>
-      </w:r>
-    </w:p>
-    <w:p>
-      <w:pPr>
-        <w:pStyle w:val="Heading2"/>
-        <w:bidi w:val="0"/>
-        <w:spacing w:before="0" w:after="0"/>
-        <w:jc w:val="start"/>
-        <w:rPr>
-          <w:rFonts w:ascii="Times New Roman" w:hAnsi="Times New Roman"/>
-          <w:b w:val="false"/>
-          <w:bCs w:val="false"/>
-          <w:sz w:val="24"/>
-          <w:szCs w:val="24"/>
-        </w:rPr>
-      </w:pPr>
-      <w:r>
-        <w:rPr>
-          <w:rFonts w:ascii="Times New Roman" w:hAnsi="Times New Roman"/>
-          <w:b w:val="false"/>
-          <w:bCs w:val="false"/>
-          <w:sz w:val="24"/>
-          <w:szCs w:val="24"/>
-        </w:rPr>
-      </w:r>
-    </w:p>
-    <w:p>
-      <w:pPr>
-        <w:pStyle w:val="Heading2"/>
-        <w:bidi w:val="0"/>
-        <w:spacing w:before="0" w:after="0"/>
+          <w:i w:val="false"/>
+          <w:iCs w:val="false"/>
+          <w:sz w:val="24"/>
+          <w:szCs w:val="24"/>
+        </w:rPr>
+      </w:r>
+    </w:p>
+    <w:p>
+      <w:pPr>
+        <w:pStyle w:val="BodyText"/>
+        <w:bidi w:val="0"/>
+        <w:spacing w:lineRule="auto" w:line="240" w:before="0" w:after="0"/>
         <w:jc w:val="start"/>
         <w:rPr>
           <w:rFonts w:ascii="Times New Roman" w:hAnsi="Times New Roman"/>
           <w:b/>
           <w:bCs/>
           <w:sz w:val="24"/>
-          <w:szCs w:val="24"/>
-        </w:rPr>
-      </w:pPr>
-      <w:r>
+        </w:rPr>
+      </w:pPr>
+      <w:r>
+        <w:rPr>
+          <w:rFonts w:ascii="Times New Roman" w:hAnsi="Times New Roman"/>
+          <w:b w:val="false"/>
+          <w:bCs w:val="false"/>
+        </w:rPr>
+        <w:t xml:space="preserve">From the valley view, we drove up the hills and reached the main village, </w:t>
+      </w:r>
+      <w:r>
+        <w:rPr>
+          <w:rStyle w:val="Emphasis"/>
+          <w:rFonts w:ascii="Times New Roman" w:hAnsi="Times New Roman"/>
+          <w:b w:val="false"/>
+          <w:bCs w:val="false"/>
+        </w:rPr>
+        <w:t>Highways Panchayat</w:t>
+      </w:r>
+      <w:r>
+        <w:rPr>
+          <w:rFonts w:ascii="Times New Roman" w:hAnsi="Times New Roman"/>
+          <w:b w:val="false"/>
+          <w:bCs w:val="false"/>
+        </w:rPr>
+        <w:t>. Surprisingly, the Panchayat maintains a guest house with about 10 rooms. We noticed that some families were staying there. The guest house is located very close to the Highways Reservoir/Dam, and there was plenty of water in the reservoir.</w:t>
+      </w:r>
+    </w:p>
+    <w:p>
+      <w:pPr>
+        <w:pStyle w:val="BodyText"/>
+        <w:bidi w:val="0"/>
+        <w:spacing w:lineRule="auto" w:line="240" w:before="0" w:after="0"/>
+        <w:jc w:val="start"/>
+        <w:rPr>
+          <w:rFonts w:ascii="Times New Roman" w:hAnsi="Times New Roman"/>
+          <w:b w:val="false"/>
+          <w:bCs w:val="false"/>
+          <w:sz w:val="24"/>
+        </w:rPr>
+      </w:pPr>
+      <w:r>
+        <w:rPr>
+          <w:rFonts w:ascii="Times New Roman" w:hAnsi="Times New Roman"/>
+          <w:b w:val="false"/>
+          <w:bCs w:val="false"/>
+          <w:sz w:val="24"/>
+        </w:rPr>
+      </w:r>
+    </w:p>
+    <w:p>
+      <w:pPr>
+        <w:pStyle w:val="BodyText"/>
+        <w:bidi w:val="0"/>
+        <w:spacing w:lineRule="auto" w:line="240" w:before="0" w:after="0"/>
+        <w:jc w:val="start"/>
+        <w:rPr>
+          <w:rFonts w:ascii="Times New Roman" w:hAnsi="Times New Roman"/>
+          <w:b w:val="false"/>
+          <w:bCs w:val="false"/>
+          <w:sz w:val="24"/>
+        </w:rPr>
+      </w:pPr>
+      <w:r>
+        <w:rPr>
+          <w:rFonts w:ascii="Times New Roman" w:hAnsi="Times New Roman"/>
+          <w:b w:val="false"/>
+          <w:bCs w:val="false"/>
+        </w:rPr>
+        <w:t>I reached out to the guest house in charge to get the contact information. Strangely, I never bothered to look at the rooms :-( Yes, you guessed it. This has to do with something that happened two months after this trip!</w:t>
+      </w:r>
+    </w:p>
+    <w:p>
+      <w:pPr>
+        <w:pStyle w:val="BodyText"/>
+        <w:bidi w:val="0"/>
+        <w:spacing w:lineRule="auto" w:line="240" w:before="0" w:after="0"/>
+        <w:jc w:val="start"/>
+        <w:rPr>
+          <w:rFonts w:ascii="Times New Roman" w:hAnsi="Times New Roman"/>
+          <w:b w:val="false"/>
+          <w:bCs w:val="false"/>
+          <w:sz w:val="24"/>
+        </w:rPr>
+      </w:pPr>
+      <w:r>
+        <w:rPr>
+          <w:rFonts w:ascii="Times New Roman" w:hAnsi="Times New Roman"/>
+          <w:b w:val="false"/>
+          <w:bCs w:val="false"/>
+          <w:sz w:val="24"/>
+        </w:rPr>
+      </w:r>
+    </w:p>
+    <w:p>
+      <w:pPr>
+        <w:pStyle w:val="BodyText"/>
+        <w:bidi w:val="0"/>
+        <w:spacing w:lineRule="auto" w:line="240" w:before="0" w:after="0"/>
+        <w:jc w:val="start"/>
+        <w:rPr>
+          <w:rFonts w:ascii="Times New Roman" w:hAnsi="Times New Roman"/>
+          <w:b w:val="false"/>
+          <w:bCs w:val="false"/>
+          <w:sz w:val="24"/>
+        </w:rPr>
+      </w:pPr>
+      <w:r>
+        <w:rPr>
+          <w:rFonts w:ascii="Times New Roman" w:hAnsi="Times New Roman"/>
+          <w:b w:val="false"/>
+          <w:bCs w:val="false"/>
+        </w:rPr>
+        <w:t>By the way, there is no other place to stay in the entire Megamalai unless you have contacts within the tea estates to use their premises.</w:t>
+      </w:r>
+    </w:p>
+    <w:p>
+      <w:pPr>
+        <w:pStyle w:val="Heading2"/>
+        <w:bidi w:val="0"/>
+        <w:spacing w:before="0" w:after="0"/>
+        <w:jc w:val="start"/>
+        <w:rPr>
+          <w:rFonts w:ascii="Times New Roman" w:hAnsi="Times New Roman"/>
+          <w:b w:val="false"/>
+          <w:bCs w:val="false"/>
+          <w:sz w:val="24"/>
+          <w:szCs w:val="24"/>
+        </w:rPr>
+      </w:pPr>
+      <w:r>
+        <w:rPr>
+          <w:rFonts w:ascii="Times New Roman" w:hAnsi="Times New Roman"/>
+          <w:b w:val="false"/>
+          <w:bCs w:val="false"/>
+          <w:sz w:val="24"/>
+          <w:szCs w:val="24"/>
+        </w:rPr>
+      </w:r>
+    </w:p>
+    <w:p>
+      <w:pPr>
+        <w:pStyle w:val="Heading2"/>
+        <w:bidi w:val="0"/>
+        <w:spacing w:before="0" w:after="0"/>
+        <w:jc w:val="start"/>
         <w:rPr>
           <w:rFonts w:ascii="Times New Roman" w:hAnsi="Times New Roman"/>
           <w:b/>
@@ -1245,254 +2794,8 @@
           <w:sz w:val="24"/>
           <w:szCs w:val="24"/>
         </w:rPr>
-        <w:t>Life in Highways Village</w:t>
-      </w:r>
-    </w:p>
-    <w:p>
-      <w:pPr>
-        <w:pStyle w:val="BodyText"/>
-        <w:bidi w:val="0"/>
-        <w:spacing w:lineRule="auto" w:line="240" w:before="0" w:after="0"/>
-        <w:jc w:val="start"/>
-        <w:rPr>
-          <w:rFonts w:ascii="Times New Roman" w:hAnsi="Times New Roman"/>
-          <w:b w:val="false"/>
-          <w:bCs w:val="false"/>
-          <w:sz w:val="24"/>
-        </w:rPr>
-      </w:pPr>
-      <w:r>
-        <w:rPr>
-          <w:rFonts w:ascii="Times New Roman" w:hAnsi="Times New Roman"/>
-          <w:b w:val="false"/>
-          <w:bCs w:val="false"/>
-        </w:rPr>
-      </w:r>
-    </w:p>
-    <w:p>
-      <w:pPr>
-        <w:pStyle w:val="BodyText"/>
-        <w:bidi w:val="0"/>
-        <w:spacing w:lineRule="auto" w:line="240" w:before="0" w:after="0"/>
-        <w:jc w:val="start"/>
-        <w:rPr>
-          <w:rFonts w:ascii="Times New Roman" w:hAnsi="Times New Roman"/>
-          <w:b w:val="false"/>
-          <w:bCs w:val="false"/>
-          <w:sz w:val="24"/>
-        </w:rPr>
-      </w:pPr>
-      <w:r>
-        <w:rPr>
-          <w:rFonts w:ascii="Times New Roman" w:hAnsi="Times New Roman"/>
-          <w:b w:val="false"/>
-          <w:bCs w:val="false"/>
-        </w:rPr>
-        <w:t>Near the guest house, you will find Murugan Hotel (actually a very small eating place), where you can get typical Tamil Nadu tiffin (idli and dosa with chutney and sambar) and a full-plate lunch (known as a thali). They do cook non-vegetarian food and egg items, provided the cook is in town and hasn’t gone to Chinnamanur to get provisions and vegetables which itself takes an entire day. There was one other small tea stall offering similar food.</w:t>
-      </w:r>
-    </w:p>
-    <w:p>
-      <w:pPr>
-        <w:pStyle w:val="BodyText"/>
-        <w:bidi w:val="0"/>
-        <w:spacing w:lineRule="auto" w:line="240" w:before="0" w:after="0"/>
-        <w:jc w:val="start"/>
-        <w:rPr>
-          <w:rFonts w:ascii="Times New Roman" w:hAnsi="Times New Roman"/>
-          <w:b w:val="false"/>
-          <w:bCs w:val="false"/>
-          <w:sz w:val="24"/>
-        </w:rPr>
-      </w:pPr>
-      <w:r>
-        <w:rPr>
-          <w:rFonts w:ascii="Times New Roman" w:hAnsi="Times New Roman"/>
-          <w:b w:val="false"/>
-          <w:bCs w:val="false"/>
-        </w:rPr>
-      </w:r>
-    </w:p>
-    <w:p>
-      <w:pPr>
-        <w:pStyle w:val="BodyText"/>
-        <w:bidi w:val="0"/>
-        <w:spacing w:lineRule="auto" w:line="240" w:before="0" w:after="0"/>
-        <w:jc w:val="start"/>
-        <w:rPr>
-          <w:rFonts w:ascii="Times New Roman" w:hAnsi="Times New Roman"/>
-          <w:b w:val="false"/>
-          <w:bCs w:val="false"/>
-          <w:sz w:val="24"/>
-        </w:rPr>
-      </w:pPr>
-      <w:r>
-        <w:rPr>
-          <w:rFonts w:ascii="Times New Roman" w:hAnsi="Times New Roman"/>
-          <w:b w:val="false"/>
-          <w:bCs w:val="false"/>
-        </w:rPr>
-        <w:t>From my conversations with a few locals, I understood that the youth from this quaint little village move out to bigger cities. As a result, the tea estates hire migrant workers from Bihar, Jharkhand, and other northern states. Even then, there was hardly any movement of local people.</w:t>
-      </w:r>
-    </w:p>
-    <w:p>
-      <w:pPr>
-        <w:pStyle w:val="BodyText"/>
-        <w:bidi w:val="0"/>
-        <w:spacing w:lineRule="auto" w:line="240" w:before="0" w:after="0"/>
-        <w:jc w:val="start"/>
-        <w:rPr>
-          <w:rFonts w:ascii="Times New Roman" w:hAnsi="Times New Roman"/>
-          <w:b w:val="false"/>
-          <w:bCs w:val="false"/>
-          <w:sz w:val="24"/>
-        </w:rPr>
-      </w:pPr>
-      <w:r>
-        <w:rPr>
-          <w:rFonts w:ascii="Times New Roman" w:hAnsi="Times New Roman"/>
-          <w:b w:val="false"/>
-          <w:bCs w:val="false"/>
-        </w:rPr>
-      </w:r>
-    </w:p>
-    <w:p>
-      <w:pPr>
-        <w:pStyle w:val="BodyText"/>
-        <w:bidi w:val="0"/>
-        <w:spacing w:lineRule="auto" w:line="240" w:before="0" w:after="0"/>
-        <w:jc w:val="start"/>
-        <w:rPr>
-          <w:rFonts w:ascii="Times New Roman" w:hAnsi="Times New Roman"/>
-          <w:b w:val="false"/>
-          <w:bCs w:val="false"/>
-          <w:sz w:val="24"/>
-        </w:rPr>
-      </w:pPr>
-      <w:r>
-        <w:rPr>
-          <w:rFonts w:ascii="Times New Roman" w:hAnsi="Times New Roman"/>
-          <w:b w:val="false"/>
-          <w:bCs w:val="false"/>
-        </w:rPr>
-        <w:t>There is a government school with about 90 students, taught by a handful of teachers. We were told that only during weekends do local tourists from nearby towns visit Megamalai for day trips. These tea stalls make most of their earnings during that time. Otherwise, their income comes mainly from labourers stopping by for tea or coffee.</w:t>
-      </w:r>
-    </w:p>
-    <w:p>
-      <w:pPr>
-        <w:pStyle w:val="BodyText"/>
-        <w:bidi w:val="0"/>
-        <w:spacing w:lineRule="auto" w:line="240" w:before="0" w:after="0"/>
-        <w:jc w:val="start"/>
-        <w:rPr>
-          <w:rFonts w:ascii="Times New Roman" w:hAnsi="Times New Roman"/>
-          <w:b w:val="false"/>
-          <w:bCs w:val="false"/>
-          <w:sz w:val="24"/>
-        </w:rPr>
-      </w:pPr>
-      <w:r>
-        <w:rPr>
-          <w:rFonts w:ascii="Times New Roman" w:hAnsi="Times New Roman"/>
-          <w:b w:val="false"/>
-          <w:bCs w:val="false"/>
-        </w:rPr>
-      </w:r>
-    </w:p>
-    <w:p>
-      <w:pPr>
-        <w:pStyle w:val="BodyText"/>
-        <w:bidi w:val="0"/>
-        <w:spacing w:lineRule="auto" w:line="240" w:before="0" w:after="0"/>
-        <w:jc w:val="start"/>
-        <w:rPr>
-          <w:rFonts w:ascii="Times New Roman" w:hAnsi="Times New Roman"/>
-          <w:b w:val="false"/>
-          <w:bCs w:val="false"/>
-          <w:sz w:val="24"/>
-        </w:rPr>
-      </w:pPr>
-      <w:r>
-        <w:rPr>
-          <w:rFonts w:ascii="Times New Roman" w:hAnsi="Times New Roman"/>
-          <w:b w:val="false"/>
-          <w:bCs w:val="false"/>
-        </w:rPr>
-        <w:t>We also noticed a police station!</w:t>
-      </w:r>
-    </w:p>
-    <w:p>
-      <w:pPr>
-        <w:pStyle w:val="BodyText"/>
-        <w:bidi w:val="0"/>
-        <w:spacing w:lineRule="auto" w:line="240" w:before="0" w:after="0"/>
-        <w:jc w:val="start"/>
-        <w:rPr>
-          <w:rFonts w:ascii="Times New Roman" w:hAnsi="Times New Roman"/>
-          <w:b w:val="false"/>
-          <w:bCs w:val="false"/>
-          <w:sz w:val="24"/>
-        </w:rPr>
-      </w:pPr>
-      <w:r>
-        <w:rPr>
-          <w:rFonts w:ascii="Times New Roman" w:hAnsi="Times New Roman"/>
-          <w:b w:val="false"/>
-          <w:bCs w:val="false"/>
-        </w:rPr>
-      </w:r>
-    </w:p>
-    <w:p>
-      <w:pPr>
-        <w:pStyle w:val="BodyText"/>
-        <w:bidi w:val="0"/>
-        <w:spacing w:lineRule="auto" w:line="240" w:before="0" w:after="0"/>
-        <w:jc w:val="start"/>
-        <w:rPr>
-          <w:rFonts w:ascii="Times New Roman" w:hAnsi="Times New Roman"/>
-          <w:b w:val="false"/>
-          <w:bCs w:val="false"/>
-          <w:sz w:val="24"/>
-        </w:rPr>
-      </w:pPr>
-      <w:r>
-        <w:rPr>
-          <w:rFonts w:ascii="Times New Roman" w:hAnsi="Times New Roman"/>
-          <w:b w:val="false"/>
-          <w:bCs w:val="false"/>
-        </w:rPr>
-        <w:t>The views from Highways Panchayat were spectacular. One could simply sit under a tree, enjoy the cool breeze, read a book, or listen to the chirping of birds. We were told that sometimes leopards, lion-tailed macaques, and elephants do pass through the village. Unfortunately, we didn’t get to see any of them.</w:t>
-      </w:r>
-    </w:p>
-    <w:p>
-      <w:pPr>
-        <w:pStyle w:val="Heading2"/>
-        <w:bidi w:val="0"/>
-        <w:spacing w:before="0" w:after="0"/>
-        <w:jc w:val="start"/>
-        <w:rPr>
-          <w:rFonts w:ascii="Times New Roman" w:hAnsi="Times New Roman"/>
-          <w:b w:val="false"/>
-          <w:bCs w:val="false"/>
-          <w:sz w:val="24"/>
-          <w:szCs w:val="24"/>
-        </w:rPr>
-      </w:pPr>
-      <w:r>
-        <w:rPr>
-          <w:rFonts w:ascii="Times New Roman" w:hAnsi="Times New Roman"/>
-          <w:b w:val="false"/>
-          <w:bCs w:val="false"/>
-          <w:sz w:val="24"/>
-          <w:szCs w:val="24"/>
-        </w:rPr>
-      </w:r>
-    </w:p>
-    <w:p>
-      <w:pPr>
-        <w:pStyle w:val="Heading2"/>
-        <w:bidi w:val="0"/>
-        <w:spacing w:before="0" w:after="0"/>
-        <w:jc w:val="start"/>
+      </w:pPr>
+      <w:r>
         <w:rPr>
           <w:rFonts w:ascii="Times New Roman" w:hAnsi="Times New Roman"/>
           <w:b/>
@@ -1500,8 +2803,259 @@
           <w:sz w:val="24"/>
           <w:szCs w:val="24"/>
         </w:rPr>
-      </w:pPr>
-      <w:r>
+        <w:t>Life in Highways Village</w:t>
+      </w:r>
+    </w:p>
+    <w:p>
+      <w:pPr>
+        <w:pStyle w:val="BodyText"/>
+        <w:bidi w:val="0"/>
+        <w:spacing w:lineRule="auto" w:line="240" w:before="0" w:after="0"/>
+        <w:jc w:val="start"/>
+        <w:rPr>
+          <w:rFonts w:ascii="Times New Roman" w:hAnsi="Times New Roman"/>
+          <w:b w:val="false"/>
+          <w:bCs w:val="false"/>
+          <w:sz w:val="24"/>
+        </w:rPr>
+      </w:pPr>
+      <w:r>
+        <w:rPr>
+          <w:rFonts w:ascii="Times New Roman" w:hAnsi="Times New Roman"/>
+          <w:b w:val="false"/>
+          <w:bCs w:val="false"/>
+          <w:sz w:val="24"/>
+        </w:rPr>
+      </w:r>
+    </w:p>
+    <w:p>
+      <w:pPr>
+        <w:pStyle w:val="BodyText"/>
+        <w:bidi w:val="0"/>
+        <w:spacing w:lineRule="auto" w:line="240" w:before="0" w:after="0"/>
+        <w:jc w:val="start"/>
+        <w:rPr>
+          <w:rFonts w:ascii="Times New Roman" w:hAnsi="Times New Roman"/>
+          <w:b w:val="false"/>
+          <w:bCs w:val="false"/>
+          <w:sz w:val="24"/>
+        </w:rPr>
+      </w:pPr>
+      <w:r>
+        <w:rPr>
+          <w:rFonts w:ascii="Times New Roman" w:hAnsi="Times New Roman"/>
+          <w:b w:val="false"/>
+          <w:bCs w:val="false"/>
+        </w:rPr>
+        <w:t>Near the guest house, you will find Murugan Hotel (actually a very small eating place), where you can get typical Tamil Nadu tiffin (idli and dosa with chutney and sambar) and a full-plate lunch (known as a thali). They do cook non-vegetarian food and egg items, provided the cook is in town and hasn’t gone to Chinnamanur to get provisions and vegetables which itself takes an entire day. There was one other small tea stall offering similar food.</w:t>
+      </w:r>
+    </w:p>
+    <w:p>
+      <w:pPr>
+        <w:pStyle w:val="BodyText"/>
+        <w:bidi w:val="0"/>
+        <w:spacing w:lineRule="auto" w:line="240" w:before="0" w:after="0"/>
+        <w:jc w:val="start"/>
+        <w:rPr>
+          <w:rFonts w:ascii="Times New Roman" w:hAnsi="Times New Roman"/>
+          <w:b w:val="false"/>
+          <w:bCs w:val="false"/>
+          <w:sz w:val="24"/>
+        </w:rPr>
+      </w:pPr>
+      <w:r>
+        <w:rPr>
+          <w:rFonts w:ascii="Times New Roman" w:hAnsi="Times New Roman"/>
+          <w:b w:val="false"/>
+          <w:bCs w:val="false"/>
+          <w:sz w:val="24"/>
+        </w:rPr>
+      </w:r>
+    </w:p>
+    <w:p>
+      <w:pPr>
+        <w:pStyle w:val="BodyText"/>
+        <w:bidi w:val="0"/>
+        <w:spacing w:lineRule="auto" w:line="240" w:before="0" w:after="0"/>
+        <w:jc w:val="start"/>
+        <w:rPr>
+          <w:rFonts w:ascii="Times New Roman" w:hAnsi="Times New Roman"/>
+          <w:b w:val="false"/>
+          <w:bCs w:val="false"/>
+          <w:sz w:val="24"/>
+        </w:rPr>
+      </w:pPr>
+      <w:r>
+        <w:rPr>
+          <w:rFonts w:ascii="Times New Roman" w:hAnsi="Times New Roman"/>
+          <w:b w:val="false"/>
+          <w:bCs w:val="false"/>
+        </w:rPr>
+        <w:t>From my conversations with a few locals, I understood that the youth from this quaint little village move out to bigger cities. As a result, the tea estates hire migrant workers from Bihar, Jharkhand, and other northern states. Even then, there was hardly any movement of local people.</w:t>
+      </w:r>
+    </w:p>
+    <w:p>
+      <w:pPr>
+        <w:pStyle w:val="BodyText"/>
+        <w:bidi w:val="0"/>
+        <w:spacing w:lineRule="auto" w:line="240" w:before="0" w:after="0"/>
+        <w:jc w:val="start"/>
+        <w:rPr>
+          <w:rFonts w:ascii="Times New Roman" w:hAnsi="Times New Roman"/>
+          <w:b w:val="false"/>
+          <w:bCs w:val="false"/>
+          <w:sz w:val="24"/>
+        </w:rPr>
+      </w:pPr>
+      <w:r>
+        <w:rPr>
+          <w:rFonts w:ascii="Times New Roman" w:hAnsi="Times New Roman"/>
+          <w:b w:val="false"/>
+          <w:bCs w:val="false"/>
+          <w:sz w:val="24"/>
+        </w:rPr>
+      </w:r>
+    </w:p>
+    <w:p>
+      <w:pPr>
+        <w:pStyle w:val="BodyText"/>
+        <w:bidi w:val="0"/>
+        <w:spacing w:lineRule="auto" w:line="240" w:before="0" w:after="0"/>
+        <w:jc w:val="start"/>
+        <w:rPr>
+          <w:rFonts w:ascii="Times New Roman" w:hAnsi="Times New Roman"/>
+          <w:b w:val="false"/>
+          <w:bCs w:val="false"/>
+          <w:sz w:val="24"/>
+        </w:rPr>
+      </w:pPr>
+      <w:r>
+        <w:rPr>
+          <w:rFonts w:ascii="Times New Roman" w:hAnsi="Times New Roman"/>
+          <w:b w:val="false"/>
+          <w:bCs w:val="false"/>
+        </w:rPr>
+        <w:t>There is a government school with about 90 students, taught by a handful of teachers. We were told that only during weekends do local tourists from nearby towns visit Megamalai for day trips. These tea stalls make most of their earnings during that time. Otherwise, their income comes mainly from labourers stopping by for tea or coffee.</w:t>
+      </w:r>
+    </w:p>
+    <w:p>
+      <w:pPr>
+        <w:pStyle w:val="BodyText"/>
+        <w:bidi w:val="0"/>
+        <w:spacing w:lineRule="auto" w:line="240" w:before="0" w:after="0"/>
+        <w:jc w:val="start"/>
+        <w:rPr>
+          <w:rFonts w:ascii="Times New Roman" w:hAnsi="Times New Roman"/>
+          <w:b w:val="false"/>
+          <w:bCs w:val="false"/>
+          <w:sz w:val="24"/>
+        </w:rPr>
+      </w:pPr>
+      <w:r>
+        <w:rPr>
+          <w:rFonts w:ascii="Times New Roman" w:hAnsi="Times New Roman"/>
+          <w:b w:val="false"/>
+          <w:bCs w:val="false"/>
+          <w:sz w:val="24"/>
+        </w:rPr>
+      </w:r>
+    </w:p>
+    <w:p>
+      <w:pPr>
+        <w:pStyle w:val="BodyText"/>
+        <w:bidi w:val="0"/>
+        <w:spacing w:lineRule="auto" w:line="240" w:before="0" w:after="0"/>
+        <w:jc w:val="start"/>
+        <w:rPr>
+          <w:rFonts w:ascii="Times New Roman" w:hAnsi="Times New Roman"/>
+          <w:b w:val="false"/>
+          <w:bCs w:val="false"/>
+          <w:sz w:val="24"/>
+        </w:rPr>
+      </w:pPr>
+      <w:r>
+        <w:rPr>
+          <w:rFonts w:ascii="Times New Roman" w:hAnsi="Times New Roman"/>
+          <w:b w:val="false"/>
+          <w:bCs w:val="false"/>
+        </w:rPr>
+        <w:t>We also noticed a police station!</w:t>
+      </w:r>
+    </w:p>
+    <w:p>
+      <w:pPr>
+        <w:pStyle w:val="BodyText"/>
+        <w:bidi w:val="0"/>
+        <w:spacing w:lineRule="auto" w:line="240" w:before="0" w:after="0"/>
+        <w:jc w:val="start"/>
+        <w:rPr>
+          <w:rFonts w:ascii="Times New Roman" w:hAnsi="Times New Roman"/>
+          <w:b w:val="false"/>
+          <w:bCs w:val="false"/>
+          <w:sz w:val="24"/>
+        </w:rPr>
+      </w:pPr>
+      <w:r>
+        <w:rPr>
+          <w:rFonts w:ascii="Times New Roman" w:hAnsi="Times New Roman"/>
+          <w:b w:val="false"/>
+          <w:bCs w:val="false"/>
+          <w:sz w:val="24"/>
+        </w:rPr>
+      </w:r>
+    </w:p>
+    <w:p>
+      <w:pPr>
+        <w:pStyle w:val="BodyText"/>
+        <w:bidi w:val="0"/>
+        <w:spacing w:lineRule="auto" w:line="240" w:before="0" w:after="0"/>
+        <w:jc w:val="start"/>
+        <w:rPr>
+          <w:rFonts w:ascii="Times New Roman" w:hAnsi="Times New Roman"/>
+          <w:b w:val="false"/>
+          <w:bCs w:val="false"/>
+          <w:sz w:val="24"/>
+        </w:rPr>
+      </w:pPr>
+      <w:r>
+        <w:rPr>
+          <w:rFonts w:ascii="Times New Roman" w:hAnsi="Times New Roman"/>
+          <w:b w:val="false"/>
+          <w:bCs w:val="false"/>
+        </w:rPr>
+        <w:t>The views from Highways Panchayat were spectacular. One could simply sit under a tree, enjoy the cool breeze, read a book, or listen to the chirping of birds. We were told that sometimes leopards, lion-tailed macaques, and elephants do pass through the village. Unfortunately, we didn’t get to see any of them.</w:t>
+      </w:r>
+    </w:p>
+    <w:p>
+      <w:pPr>
+        <w:pStyle w:val="Heading2"/>
+        <w:bidi w:val="0"/>
+        <w:spacing w:before="0" w:after="0"/>
+        <w:jc w:val="start"/>
+        <w:rPr>
+          <w:rFonts w:ascii="Times New Roman" w:hAnsi="Times New Roman"/>
+          <w:b w:val="false"/>
+          <w:bCs w:val="false"/>
+          <w:sz w:val="24"/>
+          <w:szCs w:val="24"/>
+        </w:rPr>
+      </w:pPr>
+      <w:r>
+        <w:rPr>
+          <w:rFonts w:ascii="Times New Roman" w:hAnsi="Times New Roman"/>
+          <w:b w:val="false"/>
+          <w:bCs w:val="false"/>
+          <w:sz w:val="24"/>
+          <w:szCs w:val="24"/>
+        </w:rPr>
+      </w:r>
+    </w:p>
+    <w:p>
+      <w:pPr>
+        <w:pStyle w:val="Heading2"/>
+        <w:bidi w:val="0"/>
+        <w:spacing w:before="0" w:after="0"/>
+        <w:jc w:val="start"/>
         <w:rPr>
           <w:rFonts w:ascii="Times New Roman" w:hAnsi="Times New Roman"/>
           <w:b/>
@@ -1509,27 +3063,37 @@
           <w:sz w:val="24"/>
           <w:szCs w:val="24"/>
         </w:rPr>
-        <w:t>Maharaja Mettu (High Ground / Hillock)</w:t>
-      </w:r>
-    </w:p>
-    <w:p>
-      <w:pPr>
-        <w:pStyle w:val="BodyText"/>
-        <w:bidi w:val="0"/>
-        <w:spacing w:lineRule="auto" w:line="240" w:before="0" w:after="0"/>
-        <w:jc w:val="start"/>
+      </w:pPr>
+      <w:r>
         <w:rPr>
           <w:rFonts w:ascii="Times New Roman" w:hAnsi="Times New Roman"/>
           <w:b/>
           <w:bCs/>
           <w:sz w:val="24"/>
-        </w:rPr>
-      </w:pPr>
-      <w:r>
+          <w:szCs w:val="24"/>
+        </w:rPr>
+        <w:t>Maharaja Mettu (High Ground / Hillock)</w:t>
+      </w:r>
+    </w:p>
+    <w:p>
+      <w:pPr>
+        <w:pStyle w:val="BodyText"/>
+        <w:bidi w:val="0"/>
+        <w:spacing w:lineRule="auto" w:line="240" w:before="0" w:after="0"/>
+        <w:jc w:val="start"/>
         <w:rPr>
           <w:rFonts w:ascii="Times New Roman" w:hAnsi="Times New Roman"/>
           <w:b/>
           <w:bCs/>
+          <w:sz w:val="24"/>
+        </w:rPr>
+      </w:pPr>
+      <w:r>
+        <w:rPr>
+          <w:rFonts w:ascii="Times New Roman" w:hAnsi="Times New Roman"/>
+          <w:b/>
+          <w:bCs/>
+          <w:sz w:val="24"/>
         </w:rPr>
       </w:r>
     </w:p>
@@ -1573,6 +3137,7 @@
           <w:rFonts w:ascii="Times New Roman" w:hAnsi="Times New Roman"/>
           <w:b w:val="false"/>
           <w:bCs w:val="false"/>
+          <w:sz w:val="24"/>
         </w:rPr>
       </w:r>
     </w:p>
@@ -1616,6 +3181,7 @@
           <w:rFonts w:ascii="Times New Roman" w:hAnsi="Times New Roman"/>
           <w:b w:val="false"/>
           <w:bCs w:val="false"/>
+          <w:sz w:val="24"/>
         </w:rPr>
       </w:r>
     </w:p>
@@ -1659,6 +3225,7 @@
           <w:rFonts w:ascii="Times New Roman" w:hAnsi="Times New Roman"/>
           <w:b w:val="false"/>
           <w:bCs w:val="false"/>
+          <w:sz w:val="24"/>
         </w:rPr>
       </w:r>
     </w:p>
@@ -1702,26 +3269,15 @@
         </w:rPr>
       </w:pPr>
       <w:r>
-        <w:rPr/>
-      </w:r>
-    </w:p>
-    <w:p>
-      <w:pPr>
-        <w:pStyle w:val="BodyText"/>
-        <w:bidi w:val="0"/>
-        <w:spacing w:lineRule="auto" w:line="240" w:before="0" w:after="0"/>
-        <w:jc w:val="start"/>
-        <w:rPr>
-          <w:rStyle w:val="Emphasis"/>
-          <w:rFonts w:ascii="Times New Roman" w:hAnsi="Times New Roman"/>
+        <w:rPr>
+          <w:rFonts w:ascii="Times New Roman" w:hAnsi="Times New Roman"/>
+          <w:b w:val="false"/>
+          <w:bCs w:val="false"/>
           <w:i w:val="false"/>
           <w:iCs w:val="false"/>
           <w:sz w:val="24"/>
           <w:szCs w:val="24"/>
         </w:rPr>
-      </w:pPr>
-      <w:r>
-        <w:rPr/>
       </w:r>
     </w:p>
     <w:p>
@@ -1740,26 +3296,13 @@
         </w:rPr>
       </w:pPr>
       <w:r>
-        <w:rPr/>
-      </w:r>
-    </w:p>
-    <w:p>
-      <w:pPr>
-        <w:pStyle w:val="BodyText"/>
-        <w:bidi w:val="0"/>
-        <w:spacing w:lineRule="auto" w:line="240" w:before="0" w:after="0"/>
-        <w:jc w:val="start"/>
-        <w:rPr>
-          <w:rStyle w:val="Emphasis"/>
+        <w:rPr>
           <w:rFonts w:ascii="Times New Roman" w:hAnsi="Times New Roman"/>
           <w:i w:val="false"/>
           <w:iCs w:val="false"/>
           <w:sz w:val="24"/>
           <w:szCs w:val="24"/>
         </w:rPr>
-      </w:pPr>
-      <w:r>
-        <w:rPr/>
       </w:r>
     </w:p>
     <w:p>
@@ -1778,7 +3321,63 @@
         </w:rPr>
       </w:pPr>
       <w:r>
-        <w:rPr/>
+        <w:rPr>
+          <w:rFonts w:ascii="Times New Roman" w:hAnsi="Times New Roman"/>
+          <w:i w:val="false"/>
+          <w:iCs w:val="false"/>
+          <w:sz w:val="24"/>
+          <w:szCs w:val="24"/>
+        </w:rPr>
+      </w:r>
+    </w:p>
+    <w:p>
+      <w:pPr>
+        <w:pStyle w:val="BodyText"/>
+        <w:bidi w:val="0"/>
+        <w:spacing w:lineRule="auto" w:line="240" w:before="0" w:after="0"/>
+        <w:jc w:val="start"/>
+        <w:rPr>
+          <w:rStyle w:val="Emphasis"/>
+          <w:rFonts w:ascii="Times New Roman" w:hAnsi="Times New Roman"/>
+          <w:i w:val="false"/>
+          <w:iCs w:val="false"/>
+          <w:sz w:val="24"/>
+          <w:szCs w:val="24"/>
+        </w:rPr>
+      </w:pPr>
+      <w:r>
+        <w:rPr>
+          <w:rFonts w:ascii="Times New Roman" w:hAnsi="Times New Roman"/>
+          <w:i w:val="false"/>
+          <w:iCs w:val="false"/>
+          <w:sz w:val="24"/>
+          <w:szCs w:val="24"/>
+        </w:rPr>
+      </w:r>
+    </w:p>
+    <w:p>
+      <w:pPr>
+        <w:pStyle w:val="BodyText"/>
+        <w:bidi w:val="0"/>
+        <w:spacing w:lineRule="auto" w:line="240" w:before="0" w:after="0"/>
+        <w:jc w:val="start"/>
+        <w:rPr>
+          <w:rStyle w:val="Emphasis"/>
+          <w:rFonts w:ascii="Times New Roman" w:hAnsi="Times New Roman"/>
+          <w:i w:val="false"/>
+          <w:iCs w:val="false"/>
+          <w:sz w:val="24"/>
+          <w:szCs w:val="24"/>
+        </w:rPr>
+      </w:pPr>
+      <w:r>
+        <w:rPr>
+          <w:rFonts w:ascii="Times New Roman" w:hAnsi="Times New Roman"/>
+          <w:i w:val="false"/>
+          <w:iCs w:val="false"/>
+          <w:sz w:val="24"/>
+          <w:szCs w:val="24"/>
+        </w:rPr>
       </w:r>
     </w:p>
     <w:sectPr>
@@ -1788,9 +3387,277 @@
       <w:pgNumType w:fmt="decimal"/>
       <w:formProt w:val="false"/>
       <w:textDirection w:val="lrTb"/>
+      <w:docGrid w:type="default" w:linePitch="100" w:charSpace="0"/>
     </w:sectPr>
   </w:body>
 </w:document>
+</file>
+
+<file path=word/numbering.xml><?xml version="1.0" encoding="utf-8"?>
+<w:numbering xmlns:w="http://schemas.openxmlformats.org/wordprocessingml/2006/main" xmlns:o="urn:schemas-microsoft-com:office:office" xmlns:r="http://schemas.openxmlformats.org/officeDocument/2006/relationships" xmlns:v="urn:schemas-microsoft-com:vml" xmlns:mc="http://schemas.openxmlformats.org/markup-compatibility/2006" xmlns:w14="http://schemas.microsoft.com/office/word/2010/wordml" mc:Ignorable="w14">
+  <w:abstractNum w:abstractNumId="1">
+    <w:lvl w:ilvl="0">
+      <w:start w:val="1"/>
+      <w:numFmt w:val="bullet"/>
+      <w:lvlText w:val=""/>
+      <w:lvlJc w:val="start"/>
+      <w:pPr>
+        <w:tabs>
+          <w:tab w:val="num" w:pos="709"/>
+        </w:tabs>
+        <w:ind w:start="709" w:hanging="283"/>
+      </w:pPr>
+      <w:rPr>
+        <w:rFonts w:ascii="Symbol" w:hAnsi="Symbol" w:cs="Symbol" w:hint="default"/>
+      </w:rPr>
+    </w:lvl>
+    <w:lvl w:ilvl="1">
+      <w:start w:val="1"/>
+      <w:numFmt w:val="bullet"/>
+      <w:lvlText w:val=""/>
+      <w:lvlJc w:val="start"/>
+      <w:pPr>
+        <w:tabs>
+          <w:tab w:val="num" w:pos="1418"/>
+        </w:tabs>
+        <w:ind w:start="1418" w:hanging="283"/>
+      </w:pPr>
+      <w:rPr>
+        <w:rFonts w:ascii="Symbol" w:hAnsi="Symbol" w:cs="Symbol" w:hint="default"/>
+      </w:rPr>
+    </w:lvl>
+    <w:lvl w:ilvl="2">
+      <w:start w:val="1"/>
+      <w:numFmt w:val="bullet"/>
+      <w:lvlText w:val=""/>
+      <w:lvlJc w:val="start"/>
+      <w:pPr>
+        <w:tabs>
+          <w:tab w:val="num" w:pos="2127"/>
+        </w:tabs>
+        <w:ind w:start="2127" w:hanging="283"/>
+      </w:pPr>
+      <w:rPr>
+        <w:rFonts w:ascii="Symbol" w:hAnsi="Symbol" w:cs="Symbol" w:hint="default"/>
+      </w:rPr>
+    </w:lvl>
+    <w:lvl w:ilvl="3">
+      <w:start w:val="1"/>
+      <w:numFmt w:val="bullet"/>
+      <w:lvlText w:val=""/>
+      <w:lvlJc w:val="start"/>
+      <w:pPr>
+        <w:tabs>
+          <w:tab w:val="num" w:pos="2836"/>
+        </w:tabs>
+        <w:ind w:start="2836" w:hanging="283"/>
+      </w:pPr>
+      <w:rPr>
+        <w:rFonts w:ascii="Symbol" w:hAnsi="Symbol" w:cs="Symbol" w:hint="default"/>
+      </w:rPr>
+    </w:lvl>
+    <w:lvl w:ilvl="4">
+      <w:start w:val="1"/>
+      <w:numFmt w:val="bullet"/>
+      <w:lvlText w:val=""/>
+      <w:lvlJc w:val="start"/>
+      <w:pPr>
+        <w:tabs>
+          <w:tab w:val="num" w:pos="3545"/>
+        </w:tabs>
+        <w:ind w:start="3545" w:hanging="283"/>
+      </w:pPr>
+      <w:rPr>
+        <w:rFonts w:ascii="Symbol" w:hAnsi="Symbol" w:cs="Symbol" w:hint="default"/>
+      </w:rPr>
+    </w:lvl>
+    <w:lvl w:ilvl="5">
+      <w:start w:val="1"/>
+      <w:numFmt w:val="bullet"/>
+      <w:lvlText w:val=""/>
+      <w:lvlJc w:val="start"/>
+      <w:pPr>
+        <w:tabs>
+          <w:tab w:val="num" w:pos="4254"/>
+        </w:tabs>
+        <w:ind w:start="4254" w:hanging="283"/>
+      </w:pPr>
+      <w:rPr>
+        <w:rFonts w:ascii="Symbol" w:hAnsi="Symbol" w:cs="Symbol" w:hint="default"/>
+      </w:rPr>
+    </w:lvl>
+    <w:lvl w:ilvl="6">
+      <w:start w:val="1"/>
+      <w:numFmt w:val="bullet"/>
+      <w:lvlText w:val=""/>
+      <w:lvlJc w:val="start"/>
+      <w:pPr>
+        <w:tabs>
+          <w:tab w:val="num" w:pos="4963"/>
+        </w:tabs>
+        <w:ind w:start="4963" w:hanging="283"/>
+      </w:pPr>
+      <w:rPr>
+        <w:rFonts w:ascii="Symbol" w:hAnsi="Symbol" w:cs="Symbol" w:hint="default"/>
+      </w:rPr>
+    </w:lvl>
+    <w:lvl w:ilvl="7">
+      <w:start w:val="1"/>
+      <w:numFmt w:val="bullet"/>
+      <w:lvlText w:val=""/>
+      <w:lvlJc w:val="start"/>
+      <w:pPr>
+        <w:tabs>
+          <w:tab w:val="num" w:pos="5672"/>
+        </w:tabs>
+        <w:ind w:start="5672" w:hanging="283"/>
+      </w:pPr>
+      <w:rPr>
+        <w:rFonts w:ascii="Symbol" w:hAnsi="Symbol" w:cs="Symbol" w:hint="default"/>
+      </w:rPr>
+    </w:lvl>
+    <w:lvl w:ilvl="8">
+      <w:start w:val="1"/>
+      <w:numFmt w:val="bullet"/>
+      <w:lvlText w:val=""/>
+      <w:lvlJc w:val="start"/>
+      <w:pPr>
+        <w:tabs>
+          <w:tab w:val="num" w:pos="6381"/>
+        </w:tabs>
+        <w:ind w:start="6381" w:hanging="283"/>
+      </w:pPr>
+      <w:rPr>
+        <w:rFonts w:ascii="Symbol" w:hAnsi="Symbol" w:cs="Symbol" w:hint="default"/>
+      </w:rPr>
+    </w:lvl>
+  </w:abstractNum>
+  <w:abstractNum w:abstractNumId="2">
+    <w:lvl w:ilvl="0">
+      <w:start w:val="1"/>
+      <w:numFmt w:val="none"/>
+      <w:suff w:val="nothing"/>
+      <w:lvlText w:val=""/>
+      <w:lvlJc w:val="start"/>
+      <w:pPr>
+        <w:tabs>
+          <w:tab w:val="num" w:pos="0"/>
+        </w:tabs>
+        <w:ind w:start="0" w:hanging="0"/>
+      </w:pPr>
+    </w:lvl>
+    <w:lvl w:ilvl="1">
+      <w:start w:val="1"/>
+      <w:numFmt w:val="none"/>
+      <w:suff w:val="nothing"/>
+      <w:lvlText w:val=""/>
+      <w:lvlJc w:val="start"/>
+      <w:pPr>
+        <w:tabs>
+          <w:tab w:val="num" w:pos="0"/>
+        </w:tabs>
+        <w:ind w:start="0" w:hanging="0"/>
+      </w:pPr>
+    </w:lvl>
+    <w:lvl w:ilvl="2">
+      <w:start w:val="1"/>
+      <w:numFmt w:val="none"/>
+      <w:suff w:val="nothing"/>
+      <w:lvlText w:val=""/>
+      <w:lvlJc w:val="start"/>
+      <w:pPr>
+        <w:tabs>
+          <w:tab w:val="num" w:pos="0"/>
+        </w:tabs>
+        <w:ind w:start="0" w:hanging="0"/>
+      </w:pPr>
+    </w:lvl>
+    <w:lvl w:ilvl="3">
+      <w:start w:val="1"/>
+      <w:numFmt w:val="none"/>
+      <w:suff w:val="nothing"/>
+      <w:lvlText w:val=""/>
+      <w:lvlJc w:val="start"/>
+      <w:pPr>
+        <w:tabs>
+          <w:tab w:val="num" w:pos="0"/>
+        </w:tabs>
+        <w:ind w:start="0" w:hanging="0"/>
+      </w:pPr>
+    </w:lvl>
+    <w:lvl w:ilvl="4">
+      <w:start w:val="1"/>
+      <w:numFmt w:val="none"/>
+      <w:suff w:val="nothing"/>
+      <w:lvlText w:val=""/>
+      <w:lvlJc w:val="start"/>
+      <w:pPr>
+        <w:tabs>
+          <w:tab w:val="num" w:pos="0"/>
+        </w:tabs>
+        <w:ind w:start="0" w:hanging="0"/>
+      </w:pPr>
+    </w:lvl>
+    <w:lvl w:ilvl="5">
+      <w:start w:val="1"/>
+      <w:numFmt w:val="none"/>
+      <w:suff w:val="nothing"/>
+      <w:lvlText w:val=""/>
+      <w:lvlJc w:val="start"/>
+      <w:pPr>
+        <w:tabs>
+          <w:tab w:val="num" w:pos="0"/>
+        </w:tabs>
+        <w:ind w:start="0" w:hanging="0"/>
+      </w:pPr>
+    </w:lvl>
+    <w:lvl w:ilvl="6">
+      <w:start w:val="1"/>
+      <w:numFmt w:val="none"/>
+      <w:suff w:val="nothing"/>
+      <w:lvlText w:val=""/>
+      <w:lvlJc w:val="start"/>
+      <w:pPr>
+        <w:tabs>
+          <w:tab w:val="num" w:pos="0"/>
+        </w:tabs>
+        <w:ind w:start="0" w:hanging="0"/>
+      </w:pPr>
+    </w:lvl>
+    <w:lvl w:ilvl="7">
+      <w:start w:val="1"/>
+      <w:numFmt w:val="none"/>
+      <w:suff w:val="nothing"/>
+      <w:lvlText w:val=""/>
+      <w:lvlJc w:val="start"/>
+      <w:pPr>
+        <w:tabs>
+          <w:tab w:val="num" w:pos="0"/>
+        </w:tabs>
+        <w:ind w:start="0" w:hanging="0"/>
+      </w:pPr>
+    </w:lvl>
+    <w:lvl w:ilvl="8">
+      <w:start w:val="1"/>
+      <w:numFmt w:val="none"/>
+      <w:suff w:val="nothing"/>
+      <w:lvlText w:val=""/>
+      <w:lvlJc w:val="start"/>
+      <w:pPr>
+        <w:tabs>
+          <w:tab w:val="num" w:pos="0"/>
+        </w:tabs>
+        <w:ind w:start="0" w:hanging="0"/>
+      </w:pPr>
+    </w:lvl>
+  </w:abstractNum>
+  <w:num w:numId="1">
+    <w:abstractNumId w:val="1"/>
+  </w:num>
+  <w:num w:numId="2">
+    <w:abstractNumId w:val="2"/>
+  </w:num>
+</w:numbering>
 </file>
 
 <file path=word/styles.xml><?xml version="1.0" encoding="utf-8"?>
@@ -1807,7 +3674,6 @@
     </w:rPrDefault>
     <w:pPrDefault>
       <w:pPr>
-        <w:widowControl/>
         <w:suppressAutoHyphens w:val="true"/>
       </w:pPr>
     </w:pPrDefault>
@@ -1817,7 +3683,10 @@
     <w:qFormat/>
     <w:pPr>
       <w:widowControl/>
+      <w:suppressAutoHyphens w:val="true"/>
       <w:bidi w:val="0"/>
+      <w:spacing w:before="0" w:after="0"/>
+      <w:jc w:val="start"/>
     </w:pPr>
     <w:rPr>
       <w:rFonts w:ascii="Helvetica Neue" w:hAnsi="Helvetica Neue" w:eastAsia="Songti SC" w:cs="Arial Unicode MS"/>
@@ -1876,6 +3745,20 @@
     <w:rPr>
       <w:b/>
       <w:bCs/>
+    </w:rPr>
+  </w:style>
+  <w:style w:type="character" w:styleId="SourceText">
+    <w:name w:val="Source Text"/>
+    <w:qFormat/>
+    <w:rPr>
+      <w:rFonts w:ascii="Liberation Mono" w:hAnsi="Liberation Mono" w:eastAsia="Liberation Mono" w:cs="Liberation Mono"/>
+    </w:rPr>
+  </w:style>
+  <w:style w:type="character" w:styleId="Bulletsuser">
+    <w:name w:val="Bullets (user)"/>
+    <w:qFormat/>
+    <w:rPr>
+      <w:rFonts w:ascii="OpenSymbol" w:hAnsi="OpenSymbol" w:eastAsia="OpenSymbol" w:cs="OpenSymbol"/>
     </w:rPr>
   </w:style>
   <w:style w:type="paragraph" w:styleId="Heading">
@@ -1951,6 +3834,19 @@
     <w:rPr>
       <w:sz w:val="12"/>
       <w:szCs w:val="12"/>
+    </w:rPr>
+  </w:style>
+  <w:style w:type="paragraph" w:styleId="PreformattedText">
+    <w:name w:val="Preformatted Text"/>
+    <w:basedOn w:val="Normal"/>
+    <w:qFormat/>
+    <w:pPr>
+      <w:spacing w:before="0" w:after="0"/>
+    </w:pPr>
+    <w:rPr>
+      <w:rFonts w:ascii="Liberation Mono" w:hAnsi="Liberation Mono" w:eastAsia="Liberation Mono" w:cs="Liberation Mono"/>
+      <w:sz w:val="20"/>
+      <w:szCs w:val="20"/>
     </w:rPr>
   </w:style>
 </w:styles>

</xml_diff>